<commit_message>
style: standardize subpage sharing headers, resolve mobile menu breadcrumb overlaps, and responsive card layouts
</commit_message>
<xml_diff>
--- a/docsoagb/Guia_Executivo_Ativacao_Pagamentos_OAGB.docx
+++ b/docsoagb/Guia_Executivo_Ativacao_Pagamentos_OAGB.docx
@@ -7,12 +7,13 @@
         <w:spacing w:before="800"/>
         <w:jc w:val="center"/>
         <w:rPr>
+          <w:rFonts w:ascii="Arial" w:hAnsi="Arial" w:cs="Arial"/>
           <w:lang w:val="pt-PT"/>
         </w:rPr>
       </w:pPr>
       <w:r>
         <w:rPr>
-          <w:rFonts w:ascii="Arial" w:hAnsi="Arial"/>
+          <w:rFonts w:ascii="Arial" w:hAnsi="Arial" w:cs="Arial"/>
           <w:b/>
           <w:color w:val="4D1C21"/>
           <w:sz w:val="36"/>
@@ -26,12 +27,13 @@
         <w:spacing w:after="800"/>
         <w:jc w:val="center"/>
         <w:rPr>
+          <w:rFonts w:ascii="Arial" w:hAnsi="Arial" w:cs="Arial"/>
           <w:lang w:val="pt-PT"/>
         </w:rPr>
       </w:pPr>
       <w:r>
         <w:rPr>
-          <w:rFonts w:ascii="Arial" w:hAnsi="Arial"/>
+          <w:rFonts w:ascii="Arial" w:hAnsi="Arial" w:cs="Arial"/>
           <w:color w:val="B1A276"/>
           <w:sz w:val="26"/>
           <w:lang w:val="pt-PT"/>
@@ -67,12 +69,13 @@
             <w:pPr>
               <w:spacing w:after="80"/>
               <w:rPr>
+                <w:rFonts w:ascii="Arial" w:hAnsi="Arial" w:cs="Arial"/>
                 <w:lang w:val="pt-PT"/>
               </w:rPr>
             </w:pPr>
             <w:r>
               <w:rPr>
-                <w:rFonts w:ascii="Arial" w:hAnsi="Arial"/>
+                <w:rFonts w:ascii="Arial" w:hAnsi="Arial" w:cs="Arial"/>
                 <w:i/>
                 <w:color w:val="505050"/>
                 <w:sz w:val="20"/>
@@ -82,24 +85,14 @@
             </w:r>
             <w:r>
               <w:rPr>
-                <w:rFonts w:ascii="Arial" w:hAnsi="Arial"/>
+                <w:rFonts w:ascii="Arial" w:hAnsi="Arial" w:cs="Arial"/>
                 <w:i/>
                 <w:color w:val="505050"/>
                 <w:sz w:val="20"/>
                 <w:lang w:val="pt-PT"/>
               </w:rPr>
               <w:br/>
-              <w:t xml:space="preserve">Objetivo: Orientar as ações comerciais e administrativas necessárias para transitar do </w:t>
-            </w:r>
-            <w:r>
-              <w:rPr>
-                <w:rFonts w:ascii="Arial" w:hAnsi="Arial"/>
-                <w:i/>
-                <w:color w:val="505050"/>
-                <w:sz w:val="20"/>
-                <w:lang w:val="pt-PT"/>
-              </w:rPr>
-              <w:t>ambiente de testes atual para a cobrança real de quotas e joias de inscrição no portal.</w:t>
+              <w:t>Objetivo: Orientar as ações comerciais e administrativas necessárias para transitar do ambiente de testes atual para a cobrança real de quotas e joias de inscrição no portal.</w:t>
             </w:r>
           </w:p>
         </w:tc>
@@ -109,6 +102,7 @@
       <w:pPr>
         <w:spacing w:before="240"/>
         <w:rPr>
+          <w:rFonts w:ascii="Arial" w:hAnsi="Arial" w:cs="Arial"/>
           <w:lang w:val="pt-PT"/>
         </w:rPr>
       </w:pPr>
@@ -118,12 +112,13 @@
         <w:keepNext/>
         <w:spacing w:before="280" w:after="120"/>
         <w:rPr>
+          <w:rFonts w:ascii="Arial" w:hAnsi="Arial" w:cs="Arial"/>
           <w:lang w:val="pt-PT"/>
         </w:rPr>
       </w:pPr>
       <w:r>
         <w:rPr>
-          <w:rFonts w:ascii="Arial" w:hAnsi="Arial"/>
+          <w:rFonts w:ascii="Arial" w:hAnsi="Arial" w:cs="Arial"/>
           <w:b/>
           <w:color w:val="4D1C21"/>
           <w:sz w:val="36"/>
@@ -136,29 +131,22 @@
       <w:pPr>
         <w:spacing w:after="120"/>
         <w:rPr>
+          <w:rFonts w:ascii="Arial" w:hAnsi="Arial" w:cs="Arial"/>
           <w:lang w:val="pt-PT"/>
         </w:rPr>
       </w:pPr>
       <w:r>
         <w:rPr>
-          <w:rFonts w:ascii="Arial" w:hAnsi="Arial"/>
+          <w:rFonts w:ascii="Arial" w:hAnsi="Arial" w:cs="Arial"/>
           <w:color w:val="1E1E1E"/>
           <w:lang w:val="pt-PT"/>
         </w:rPr>
-        <w:t>O portal da OAGB já se encontra tecnicamente preparado para receber pagamentos online sem que o utilizador saia do site. A infraestrutura atual utiliza o m</w:t>
-      </w:r>
-      <w:r>
-        <w:rPr>
-          <w:rFonts w:ascii="Arial" w:hAnsi="Arial"/>
-          <w:color w:val="1E1E1E"/>
-          <w:lang w:val="pt-PT"/>
-        </w:rPr>
-        <w:t xml:space="preserve">odelo de USSD </w:t>
+        <w:t xml:space="preserve">O portal da OAGB já se encontra tecnicamente preparado para receber pagamentos online sem que o utilizador saia do site. A infraestrutura atual utiliza o modelo de USSD </w:t>
       </w:r>
       <w:proofErr w:type="spellStart"/>
       <w:r>
         <w:rPr>
-          <w:rFonts w:ascii="Arial" w:hAnsi="Arial"/>
+          <w:rFonts w:ascii="Arial" w:hAnsi="Arial" w:cs="Arial"/>
           <w:color w:val="1E1E1E"/>
           <w:lang w:val="pt-PT"/>
         </w:rPr>
@@ -167,7 +155,7 @@
       <w:proofErr w:type="spellEnd"/>
       <w:r>
         <w:rPr>
-          <w:rFonts w:ascii="Arial" w:hAnsi="Arial"/>
+          <w:rFonts w:ascii="Arial" w:hAnsi="Arial" w:cs="Arial"/>
           <w:color w:val="1E1E1E"/>
           <w:lang w:val="pt-PT"/>
         </w:rPr>
@@ -178,11 +166,96 @@
       <w:pPr>
         <w:spacing w:after="120"/>
         <w:rPr>
+          <w:rFonts w:ascii="Arial" w:hAnsi="Arial" w:cs="Arial"/>
           <w:lang w:val="pt-PT"/>
         </w:rPr>
       </w:pPr>
       <w:r>
-        <w:t>Embora o Stripe não processe diretamente na Guiné-Bissau, o **PayPal cobre oficialmente o país**, tornando-se uma solução fidedigna e de alta credibilidade internacional. Abaixo detalhamos o protocolo administrativo e técnico para ligar as operadoras móveis locais (Orange Money e MTN MoMo), o gateway global PayPal e os agregadores regionais à conta bancária da OAGB.</w:t>
+        <w:rPr>
+          <w:rFonts w:ascii="Arial" w:hAnsi="Arial" w:cs="Arial"/>
+          <w:lang w:val="pt-PT"/>
+        </w:rPr>
+        <w:t xml:space="preserve">Embora o </w:t>
+      </w:r>
+      <w:proofErr w:type="spellStart"/>
+      <w:r>
+        <w:rPr>
+          <w:rFonts w:ascii="Arial" w:hAnsi="Arial" w:cs="Arial"/>
+          <w:lang w:val="pt-PT"/>
+        </w:rPr>
+        <w:t>Stripe</w:t>
+      </w:r>
+      <w:proofErr w:type="spellEnd"/>
+      <w:r>
+        <w:rPr>
+          <w:rFonts w:ascii="Arial" w:hAnsi="Arial" w:cs="Arial"/>
+          <w:lang w:val="pt-PT"/>
+        </w:rPr>
+        <w:t xml:space="preserve"> não processe diretamente na Guiné-Bissau, o **</w:t>
+      </w:r>
+      <w:proofErr w:type="spellStart"/>
+      <w:r>
+        <w:rPr>
+          <w:rFonts w:ascii="Arial" w:hAnsi="Arial" w:cs="Arial"/>
+          <w:lang w:val="pt-PT"/>
+        </w:rPr>
+        <w:t>PayPal</w:t>
+      </w:r>
+      <w:proofErr w:type="spellEnd"/>
+      <w:r>
+        <w:rPr>
+          <w:rFonts w:ascii="Arial" w:hAnsi="Arial" w:cs="Arial"/>
+          <w:lang w:val="pt-PT"/>
+        </w:rPr>
+        <w:t xml:space="preserve"> cobre oficialmente o país**, tornando-se uma solução fidedigna e de alta credibilidade internacional. Abaixo detalhamos o protocolo administrativo e técnico para ligar as operadoras móveis locais (Orange Money e MTN </w:t>
+      </w:r>
+      <w:proofErr w:type="spellStart"/>
+      <w:r>
+        <w:rPr>
+          <w:rFonts w:ascii="Arial" w:hAnsi="Arial" w:cs="Arial"/>
+          <w:lang w:val="pt-PT"/>
+        </w:rPr>
+        <w:t>MoMo</w:t>
+      </w:r>
+      <w:proofErr w:type="spellEnd"/>
+      <w:r>
+        <w:rPr>
+          <w:rFonts w:ascii="Arial" w:hAnsi="Arial" w:cs="Arial"/>
+          <w:lang w:val="pt-PT"/>
+        </w:rPr>
+        <w:t xml:space="preserve">), o </w:t>
+      </w:r>
+      <w:proofErr w:type="spellStart"/>
+      <w:r>
+        <w:rPr>
+          <w:rFonts w:ascii="Arial" w:hAnsi="Arial" w:cs="Arial"/>
+          <w:lang w:val="pt-PT"/>
+        </w:rPr>
+        <w:t>gateway</w:t>
+      </w:r>
+      <w:proofErr w:type="spellEnd"/>
+      <w:r>
+        <w:rPr>
+          <w:rFonts w:ascii="Arial" w:hAnsi="Arial" w:cs="Arial"/>
+          <w:lang w:val="pt-PT"/>
+        </w:rPr>
+        <w:t xml:space="preserve"> global </w:t>
+      </w:r>
+      <w:proofErr w:type="spellStart"/>
+      <w:r>
+        <w:rPr>
+          <w:rFonts w:ascii="Arial" w:hAnsi="Arial" w:cs="Arial"/>
+          <w:lang w:val="pt-PT"/>
+        </w:rPr>
+        <w:t>PayPal</w:t>
+      </w:r>
+      <w:proofErr w:type="spellEnd"/>
+      <w:r>
+        <w:rPr>
+          <w:rFonts w:ascii="Arial" w:hAnsi="Arial" w:cs="Arial"/>
+          <w:lang w:val="pt-PT"/>
+        </w:rPr>
+        <w:t xml:space="preserve"> e os agregadores regionais à conta bancária da OAGB.</w:t>
       </w:r>
     </w:p>
     <w:p>
@@ -190,12 +263,13 @@
         <w:keepNext/>
         <w:spacing w:before="280" w:after="120"/>
         <w:rPr>
+          <w:rFonts w:ascii="Arial" w:hAnsi="Arial" w:cs="Arial"/>
           <w:lang w:val="pt-PT"/>
         </w:rPr>
       </w:pPr>
       <w:r>
         <w:rPr>
-          <w:rFonts w:ascii="Arial" w:hAnsi="Arial"/>
+          <w:rFonts w:ascii="Arial" w:hAnsi="Arial" w:cs="Arial"/>
           <w:b/>
           <w:color w:val="4D1C21"/>
           <w:sz w:val="26"/>
@@ -206,7 +280,7 @@
       <w:proofErr w:type="spellStart"/>
       <w:r>
         <w:rPr>
-          <w:rFonts w:ascii="Arial" w:hAnsi="Arial"/>
+          <w:rFonts w:ascii="Arial" w:hAnsi="Arial" w:cs="Arial"/>
           <w:b/>
           <w:color w:val="4D1C21"/>
           <w:sz w:val="26"/>
@@ -217,7 +291,7 @@
       <w:proofErr w:type="spellEnd"/>
       <w:r>
         <w:rPr>
-          <w:rFonts w:ascii="Arial" w:hAnsi="Arial"/>
+          <w:rFonts w:ascii="Arial" w:hAnsi="Arial" w:cs="Arial"/>
           <w:b/>
           <w:color w:val="4D1C21"/>
           <w:sz w:val="26"/>
@@ -230,29 +304,22 @@
       <w:pPr>
         <w:spacing w:after="120"/>
         <w:rPr>
+          <w:rFonts w:ascii="Arial" w:hAnsi="Arial" w:cs="Arial"/>
           <w:lang w:val="pt-PT"/>
         </w:rPr>
       </w:pPr>
       <w:r>
         <w:rPr>
-          <w:rFonts w:ascii="Arial" w:hAnsi="Arial"/>
+          <w:rFonts w:ascii="Arial" w:hAnsi="Arial" w:cs="Arial"/>
           <w:color w:val="1E1E1E"/>
           <w:lang w:val="pt-PT"/>
         </w:rPr>
-        <w:t>Para que o portal consiga disparar o pedido de PIN real par</w:t>
-      </w:r>
-      <w:r>
-        <w:rPr>
-          <w:rFonts w:ascii="Arial" w:hAnsi="Arial"/>
-          <w:color w:val="1E1E1E"/>
-          <w:lang w:val="pt-PT"/>
-        </w:rPr>
-        <w:t xml:space="preserve">a os telemóveis dos inscritos, a OAGB deve estabelecer um contrato comercial de Integração de Comerciante (Merchant </w:t>
+        <w:t xml:space="preserve">Para que o portal consiga disparar o pedido de PIN real para os telemóveis dos inscritos, a OAGB deve estabelecer um contrato comercial de Integração de Comerciante (Merchant </w:t>
       </w:r>
       <w:proofErr w:type="spellStart"/>
       <w:r>
         <w:rPr>
-          <w:rFonts w:ascii="Arial" w:hAnsi="Arial"/>
+          <w:rFonts w:ascii="Arial" w:hAnsi="Arial" w:cs="Arial"/>
           <w:color w:val="1E1E1E"/>
           <w:lang w:val="pt-PT"/>
         </w:rPr>
@@ -261,7 +328,7 @@
       <w:proofErr w:type="spellEnd"/>
       <w:r>
         <w:rPr>
-          <w:rFonts w:ascii="Arial" w:hAnsi="Arial"/>
+          <w:rFonts w:ascii="Arial" w:hAnsi="Arial" w:cs="Arial"/>
           <w:color w:val="1E1E1E"/>
           <w:lang w:val="pt-PT"/>
         </w:rPr>
@@ -273,12 +340,13 @@
         <w:keepNext/>
         <w:spacing w:before="280" w:after="120"/>
         <w:rPr>
+          <w:rFonts w:ascii="Arial" w:hAnsi="Arial" w:cs="Arial"/>
           <w:lang w:val="pt-PT"/>
         </w:rPr>
       </w:pPr>
       <w:r>
         <w:rPr>
-          <w:rFonts w:ascii="Arial" w:hAnsi="Arial"/>
+          <w:rFonts w:ascii="Arial" w:hAnsi="Arial" w:cs="Arial"/>
           <w:b/>
           <w:color w:val="B1A276"/>
           <w:sz w:val="23"/>
@@ -291,28 +359,21 @@
       <w:pPr>
         <w:spacing w:after="120"/>
         <w:rPr>
+          <w:rFonts w:ascii="Arial" w:hAnsi="Arial" w:cs="Arial"/>
           <w:lang w:val="pt-PT"/>
         </w:rPr>
       </w:pPr>
       <w:r>
         <w:rPr>
-          <w:rFonts w:ascii="Arial" w:hAnsi="Arial"/>
+          <w:rFonts w:ascii="Arial" w:hAnsi="Arial" w:cs="Arial"/>
           <w:color w:val="1E1E1E"/>
           <w:lang w:val="pt-PT"/>
         </w:rPr>
-        <w:t>A OAGB deve enviar um ofício formal ao departamento de</w:t>
+        <w:t>A OAGB deve enviar um ofício formal ao departamento de parcerias corporativas da Orange Bissau solicitando:</w:t>
       </w:r>
       <w:r>
         <w:rPr>
-          <w:rFonts w:ascii="Arial" w:hAnsi="Arial"/>
-          <w:color w:val="1E1E1E"/>
-          <w:lang w:val="pt-PT"/>
-        </w:rPr>
-        <w:t xml:space="preserve"> parcerias corporativas da Orange Bissau solicitando:</w:t>
-      </w:r>
-      <w:r>
-        <w:rPr>
-          <w:rFonts w:ascii="Arial" w:hAnsi="Arial"/>
+          <w:rFonts w:ascii="Arial" w:hAnsi="Arial" w:cs="Arial"/>
           <w:color w:val="1E1E1E"/>
           <w:lang w:val="pt-PT"/>
         </w:rPr>
@@ -322,7 +383,7 @@
       <w:proofErr w:type="spellStart"/>
       <w:r>
         <w:rPr>
-          <w:rFonts w:ascii="Arial" w:hAnsi="Arial"/>
+          <w:rFonts w:ascii="Arial" w:hAnsi="Arial" w:cs="Arial"/>
           <w:color w:val="1E1E1E"/>
           <w:lang w:val="pt-PT"/>
         </w:rPr>
@@ -331,7 +392,7 @@
       <w:proofErr w:type="spellEnd"/>
       <w:r>
         <w:rPr>
-          <w:rFonts w:ascii="Arial" w:hAnsi="Arial"/>
+          <w:rFonts w:ascii="Arial" w:hAnsi="Arial" w:cs="Arial"/>
           <w:color w:val="1E1E1E"/>
           <w:lang w:val="pt-PT"/>
         </w:rPr>
@@ -340,7 +401,7 @@
       <w:proofErr w:type="spellStart"/>
       <w:r>
         <w:rPr>
-          <w:rFonts w:ascii="Arial" w:hAnsi="Arial"/>
+          <w:rFonts w:ascii="Arial" w:hAnsi="Arial" w:cs="Arial"/>
           <w:color w:val="1E1E1E"/>
           <w:lang w:val="pt-PT"/>
         </w:rPr>
@@ -349,7 +410,7 @@
       <w:proofErr w:type="spellEnd"/>
       <w:r>
         <w:rPr>
-          <w:rFonts w:ascii="Arial" w:hAnsi="Arial"/>
+          <w:rFonts w:ascii="Arial" w:hAnsi="Arial" w:cs="Arial"/>
           <w:color w:val="1E1E1E"/>
           <w:lang w:val="pt-PT"/>
         </w:rPr>
@@ -357,7 +418,7 @@
       </w:r>
       <w:r>
         <w:rPr>
-          <w:rFonts w:ascii="Arial" w:hAnsi="Arial"/>
+          <w:rFonts w:ascii="Arial" w:hAnsi="Arial" w:cs="Arial"/>
           <w:color w:val="1E1E1E"/>
           <w:lang w:val="pt-PT"/>
         </w:rPr>
@@ -367,7 +428,7 @@
       <w:proofErr w:type="spellStart"/>
       <w:r>
         <w:rPr>
-          <w:rFonts w:ascii="Arial" w:hAnsi="Arial"/>
+          <w:rFonts w:ascii="Arial" w:hAnsi="Arial" w:cs="Arial"/>
           <w:color w:val="1E1E1E"/>
           <w:lang w:val="pt-PT"/>
         </w:rPr>
@@ -376,23 +437,15 @@
       <w:proofErr w:type="spellEnd"/>
       <w:r>
         <w:rPr>
-          <w:rFonts w:ascii="Arial" w:hAnsi="Arial"/>
+          <w:rFonts w:ascii="Arial" w:hAnsi="Arial" w:cs="Arial"/>
           <w:color w:val="1E1E1E"/>
           <w:lang w:val="pt-PT"/>
         </w:rPr>
-        <w:t xml:space="preserve">) associada à conta bancária da </w:t>
+        <w:t>) associada à conta bancária da OAGB.</w:t>
       </w:r>
       <w:r>
         <w:rPr>
-          <w:rFonts w:ascii="Arial" w:hAnsi="Arial"/>
-          <w:color w:val="1E1E1E"/>
-          <w:lang w:val="pt-PT"/>
-        </w:rPr>
-        <w:t>OAGB.</w:t>
-      </w:r>
-      <w:r>
-        <w:rPr>
-          <w:rFonts w:ascii="Arial" w:hAnsi="Arial"/>
+          <w:rFonts w:ascii="Arial" w:hAnsi="Arial" w:cs="Arial"/>
           <w:color w:val="1E1E1E"/>
           <w:lang w:val="pt-PT"/>
         </w:rPr>
@@ -402,7 +455,7 @@
       <w:proofErr w:type="spellStart"/>
       <w:r>
         <w:rPr>
-          <w:rFonts w:ascii="Arial" w:hAnsi="Arial"/>
+          <w:rFonts w:ascii="Arial" w:hAnsi="Arial" w:cs="Arial"/>
           <w:color w:val="1E1E1E"/>
           <w:lang w:val="pt-PT"/>
         </w:rPr>
@@ -411,7 +464,7 @@
       <w:proofErr w:type="spellEnd"/>
       <w:r>
         <w:rPr>
-          <w:rFonts w:ascii="Arial" w:hAnsi="Arial"/>
+          <w:rFonts w:ascii="Arial" w:hAnsi="Arial" w:cs="Arial"/>
           <w:color w:val="1E1E1E"/>
           <w:lang w:val="pt-PT"/>
         </w:rPr>
@@ -420,7 +473,7 @@
       <w:proofErr w:type="spellStart"/>
       <w:r>
         <w:rPr>
-          <w:rFonts w:ascii="Arial" w:hAnsi="Arial"/>
+          <w:rFonts w:ascii="Arial" w:hAnsi="Arial" w:cs="Arial"/>
           <w:color w:val="1E1E1E"/>
           <w:lang w:val="pt-PT"/>
         </w:rPr>
@@ -429,7 +482,7 @@
       <w:proofErr w:type="spellEnd"/>
       <w:r>
         <w:rPr>
-          <w:rFonts w:ascii="Arial" w:hAnsi="Arial"/>
+          <w:rFonts w:ascii="Arial" w:hAnsi="Arial" w:cs="Arial"/>
           <w:color w:val="1E1E1E"/>
           <w:lang w:val="pt-PT"/>
         </w:rPr>
@@ -438,7 +491,7 @@
       <w:proofErr w:type="spellStart"/>
       <w:r>
         <w:rPr>
-          <w:rFonts w:ascii="Arial" w:hAnsi="Arial"/>
+          <w:rFonts w:ascii="Arial" w:hAnsi="Arial" w:cs="Arial"/>
           <w:color w:val="1E1E1E"/>
           <w:lang w:val="pt-PT"/>
         </w:rPr>
@@ -447,7 +500,7 @@
       <w:proofErr w:type="spellEnd"/>
       <w:r>
         <w:rPr>
-          <w:rFonts w:ascii="Arial" w:hAnsi="Arial"/>
+          <w:rFonts w:ascii="Arial" w:hAnsi="Arial" w:cs="Arial"/>
           <w:color w:val="1E1E1E"/>
           <w:lang w:val="pt-PT"/>
         </w:rPr>
@@ -456,7 +509,7 @@
       <w:proofErr w:type="spellStart"/>
       <w:r>
         <w:rPr>
-          <w:rFonts w:ascii="Arial" w:hAnsi="Arial"/>
+          <w:rFonts w:ascii="Arial" w:hAnsi="Arial" w:cs="Arial"/>
           <w:color w:val="1E1E1E"/>
           <w:lang w:val="pt-PT"/>
         </w:rPr>
@@ -465,7 +518,7 @@
       <w:proofErr w:type="spellEnd"/>
       <w:r>
         <w:rPr>
-          <w:rFonts w:ascii="Arial" w:hAnsi="Arial"/>
+          <w:rFonts w:ascii="Arial" w:hAnsi="Arial" w:cs="Arial"/>
           <w:color w:val="1E1E1E"/>
           <w:lang w:val="pt-PT"/>
         </w:rPr>
@@ -477,12 +530,13 @@
         <w:keepNext/>
         <w:spacing w:before="280" w:after="120"/>
         <w:rPr>
+          <w:rFonts w:ascii="Arial" w:hAnsi="Arial" w:cs="Arial"/>
           <w:lang w:val="pt-PT"/>
         </w:rPr>
       </w:pPr>
       <w:r>
         <w:rPr>
-          <w:rFonts w:ascii="Arial" w:hAnsi="Arial"/>
+          <w:rFonts w:ascii="Arial" w:hAnsi="Arial" w:cs="Arial"/>
           <w:b/>
           <w:color w:val="B1A276"/>
           <w:sz w:val="23"/>
@@ -494,7 +548,7 @@
       <w:proofErr w:type="spellStart"/>
       <w:r>
         <w:rPr>
-          <w:rFonts w:ascii="Arial" w:hAnsi="Arial"/>
+          <w:rFonts w:ascii="Arial" w:hAnsi="Arial" w:cs="Arial"/>
           <w:b/>
           <w:color w:val="B1A276"/>
           <w:sz w:val="23"/>
@@ -505,7 +559,7 @@
       <w:proofErr w:type="spellEnd"/>
       <w:r>
         <w:rPr>
-          <w:rFonts w:ascii="Arial" w:hAnsi="Arial"/>
+          <w:rFonts w:ascii="Arial" w:hAnsi="Arial" w:cs="Arial"/>
           <w:b/>
           <w:color w:val="B1A276"/>
           <w:sz w:val="23"/>
@@ -518,12 +572,13 @@
       <w:pPr>
         <w:spacing w:after="120"/>
         <w:rPr>
+          <w:rFonts w:ascii="Arial" w:hAnsi="Arial" w:cs="Arial"/>
           <w:lang w:val="pt-PT"/>
         </w:rPr>
       </w:pPr>
       <w:r>
         <w:rPr>
-          <w:rFonts w:ascii="Arial" w:hAnsi="Arial"/>
+          <w:rFonts w:ascii="Arial" w:hAnsi="Arial" w:cs="Arial"/>
           <w:color w:val="1E1E1E"/>
           <w:lang w:val="pt-PT"/>
         </w:rPr>
@@ -531,7 +586,7 @@
       </w:r>
       <w:r>
         <w:rPr>
-          <w:rFonts w:ascii="Arial" w:hAnsi="Arial"/>
+          <w:rFonts w:ascii="Arial" w:hAnsi="Arial" w:cs="Arial"/>
           <w:color w:val="1E1E1E"/>
           <w:lang w:val="pt-PT"/>
         </w:rPr>
@@ -541,7 +596,7 @@
       <w:proofErr w:type="spellStart"/>
       <w:r>
         <w:rPr>
-          <w:rFonts w:ascii="Arial" w:hAnsi="Arial"/>
+          <w:rFonts w:ascii="Arial" w:hAnsi="Arial" w:cs="Arial"/>
           <w:color w:val="1E1E1E"/>
           <w:lang w:val="pt-PT"/>
         </w:rPr>
@@ -550,7 +605,7 @@
       <w:proofErr w:type="spellEnd"/>
       <w:r>
         <w:rPr>
-          <w:rFonts w:ascii="Arial" w:hAnsi="Arial"/>
+          <w:rFonts w:ascii="Arial" w:hAnsi="Arial" w:cs="Arial"/>
           <w:color w:val="1E1E1E"/>
           <w:lang w:val="pt-PT"/>
         </w:rPr>
@@ -559,7 +614,7 @@
       <w:proofErr w:type="spellStart"/>
       <w:r>
         <w:rPr>
-          <w:rFonts w:ascii="Arial" w:hAnsi="Arial"/>
+          <w:rFonts w:ascii="Arial" w:hAnsi="Arial" w:cs="Arial"/>
           <w:color w:val="1E1E1E"/>
           <w:lang w:val="pt-PT"/>
         </w:rPr>
@@ -568,7 +623,7 @@
       <w:proofErr w:type="spellEnd"/>
       <w:r>
         <w:rPr>
-          <w:rFonts w:ascii="Arial" w:hAnsi="Arial"/>
+          <w:rFonts w:ascii="Arial" w:hAnsi="Arial" w:cs="Arial"/>
           <w:color w:val="1E1E1E"/>
           <w:lang w:val="pt-PT"/>
         </w:rPr>
@@ -576,7 +631,7 @@
       </w:r>
       <w:r>
         <w:rPr>
-          <w:rFonts w:ascii="Arial" w:hAnsi="Arial"/>
+          <w:rFonts w:ascii="Arial" w:hAnsi="Arial" w:cs="Arial"/>
           <w:color w:val="1E1E1E"/>
           <w:lang w:val="pt-PT"/>
         </w:rPr>
@@ -586,7 +641,7 @@
       <w:proofErr w:type="spellStart"/>
       <w:r>
         <w:rPr>
-          <w:rFonts w:ascii="Arial" w:hAnsi="Arial"/>
+          <w:rFonts w:ascii="Arial" w:hAnsi="Arial" w:cs="Arial"/>
           <w:color w:val="1E1E1E"/>
           <w:lang w:val="pt-PT"/>
         </w:rPr>
@@ -595,7 +650,7 @@
       <w:proofErr w:type="spellEnd"/>
       <w:r>
         <w:rPr>
-          <w:rFonts w:ascii="Arial" w:hAnsi="Arial"/>
+          <w:rFonts w:ascii="Arial" w:hAnsi="Arial" w:cs="Arial"/>
           <w:color w:val="1E1E1E"/>
           <w:lang w:val="pt-PT"/>
         </w:rPr>
@@ -603,7 +658,7 @@
       </w:r>
       <w:r>
         <w:rPr>
-          <w:rFonts w:ascii="Arial" w:hAnsi="Arial"/>
+          <w:rFonts w:ascii="Arial" w:hAnsi="Arial" w:cs="Arial"/>
           <w:color w:val="1E1E1E"/>
           <w:lang w:val="pt-PT"/>
         </w:rPr>
@@ -613,7 +668,7 @@
       <w:proofErr w:type="spellStart"/>
       <w:r>
         <w:rPr>
-          <w:rFonts w:ascii="Arial" w:hAnsi="Arial"/>
+          <w:rFonts w:ascii="Arial" w:hAnsi="Arial" w:cs="Arial"/>
           <w:color w:val="1E1E1E"/>
           <w:lang w:val="pt-PT"/>
         </w:rPr>
@@ -622,7 +677,7 @@
       <w:proofErr w:type="spellEnd"/>
       <w:r>
         <w:rPr>
-          <w:rFonts w:ascii="Arial" w:hAnsi="Arial"/>
+          <w:rFonts w:ascii="Arial" w:hAnsi="Arial" w:cs="Arial"/>
           <w:color w:val="1E1E1E"/>
           <w:lang w:val="pt-PT"/>
         </w:rPr>
@@ -631,7 +686,7 @@
       <w:proofErr w:type="spellStart"/>
       <w:r>
         <w:rPr>
-          <w:rFonts w:ascii="Arial" w:hAnsi="Arial"/>
+          <w:rFonts w:ascii="Arial" w:hAnsi="Arial" w:cs="Arial"/>
           <w:color w:val="1E1E1E"/>
           <w:lang w:val="pt-PT"/>
         </w:rPr>
@@ -640,7 +695,7 @@
       <w:proofErr w:type="spellEnd"/>
       <w:r>
         <w:rPr>
-          <w:rFonts w:ascii="Arial" w:hAnsi="Arial"/>
+          <w:rFonts w:ascii="Arial" w:hAnsi="Arial" w:cs="Arial"/>
           <w:color w:val="1E1E1E"/>
           <w:lang w:val="pt-PT"/>
         </w:rPr>
@@ -649,7 +704,7 @@
       <w:proofErr w:type="spellStart"/>
       <w:r>
         <w:rPr>
-          <w:rFonts w:ascii="Arial" w:hAnsi="Arial"/>
+          <w:rFonts w:ascii="Arial" w:hAnsi="Arial" w:cs="Arial"/>
           <w:color w:val="1E1E1E"/>
           <w:lang w:val="pt-PT"/>
         </w:rPr>
@@ -658,7 +713,7 @@
       <w:proofErr w:type="spellEnd"/>
       <w:r>
         <w:rPr>
-          <w:rFonts w:ascii="Arial" w:hAnsi="Arial"/>
+          <w:rFonts w:ascii="Arial" w:hAnsi="Arial" w:cs="Arial"/>
           <w:color w:val="1E1E1E"/>
           <w:lang w:val="pt-PT"/>
         </w:rPr>
@@ -667,7 +722,7 @@
       <w:proofErr w:type="spellStart"/>
       <w:r>
         <w:rPr>
-          <w:rFonts w:ascii="Arial" w:hAnsi="Arial"/>
+          <w:rFonts w:ascii="Arial" w:hAnsi="Arial" w:cs="Arial"/>
           <w:color w:val="1E1E1E"/>
           <w:lang w:val="pt-PT"/>
         </w:rPr>
@@ -676,7 +731,7 @@
       <w:proofErr w:type="spellEnd"/>
       <w:r>
         <w:rPr>
-          <w:rFonts w:ascii="Arial" w:hAnsi="Arial"/>
+          <w:rFonts w:ascii="Arial" w:hAnsi="Arial" w:cs="Arial"/>
           <w:color w:val="1E1E1E"/>
           <w:lang w:val="pt-PT"/>
         </w:rPr>
@@ -685,7 +740,7 @@
       <w:proofErr w:type="spellStart"/>
       <w:r>
         <w:rPr>
-          <w:rFonts w:ascii="Arial" w:hAnsi="Arial"/>
+          <w:rFonts w:ascii="Arial" w:hAnsi="Arial" w:cs="Arial"/>
           <w:color w:val="1E1E1E"/>
           <w:lang w:val="pt-PT"/>
         </w:rPr>
@@ -694,7 +749,7 @@
       <w:proofErr w:type="spellEnd"/>
       <w:r>
         <w:rPr>
-          <w:rFonts w:ascii="Arial" w:hAnsi="Arial"/>
+          <w:rFonts w:ascii="Arial" w:hAnsi="Arial" w:cs="Arial"/>
           <w:color w:val="1E1E1E"/>
           <w:lang w:val="pt-PT"/>
         </w:rPr>
@@ -703,7 +758,7 @@
       <w:proofErr w:type="spellStart"/>
       <w:r>
         <w:rPr>
-          <w:rFonts w:ascii="Arial" w:hAnsi="Arial"/>
+          <w:rFonts w:ascii="Arial" w:hAnsi="Arial" w:cs="Arial"/>
           <w:color w:val="1E1E1E"/>
           <w:lang w:val="pt-PT"/>
         </w:rPr>
@@ -712,7 +767,7 @@
       <w:proofErr w:type="spellEnd"/>
       <w:r>
         <w:rPr>
-          <w:rFonts w:ascii="Arial" w:hAnsi="Arial"/>
+          <w:rFonts w:ascii="Arial" w:hAnsi="Arial" w:cs="Arial"/>
           <w:color w:val="1E1E1E"/>
           <w:lang w:val="pt-PT"/>
         </w:rPr>
@@ -743,12 +798,13 @@
             <w:pPr>
               <w:spacing w:before="80" w:after="80"/>
               <w:rPr>
+                <w:rFonts w:ascii="Arial" w:hAnsi="Arial" w:cs="Arial"/>
                 <w:lang w:val="pt-PT"/>
               </w:rPr>
             </w:pPr>
             <w:r>
               <w:rPr>
-                <w:rFonts w:ascii="Arial" w:hAnsi="Arial"/>
+                <w:rFonts w:ascii="Segoe UI Emoji" w:hAnsi="Segoe UI Emoji" w:cs="Segoe UI Emoji"/>
                 <w:b/>
                 <w:color w:val="4D1C21"/>
                 <w:sz w:val="20"/>
@@ -757,38 +813,18 @@
             </w:r>
             <w:r>
               <w:rPr>
-                <w:rFonts w:ascii="Arial" w:hAnsi="Arial"/>
+                <w:rFonts w:ascii="Arial" w:hAnsi="Arial" w:cs="Arial"/>
                 <w:b/>
                 <w:color w:val="4D1C21"/>
                 <w:sz w:val="20"/>
                 <w:lang w:val="pt-PT"/>
               </w:rPr>
-              <w:t xml:space="preserve"> EXPLICAÇÃO</w:t>
-            </w:r>
-            <w:r>
-              <w:rPr>
-                <w:rFonts w:ascii="Arial" w:hAnsi="Arial"/>
-                <w:b/>
-                <w:color w:val="4D1C21"/>
-                <w:sz w:val="20"/>
-                <w:lang w:val="pt-PT"/>
-              </w:rPr>
-              <w:t xml:space="preserve">: O </w:t>
-            </w:r>
-            <w:r>
-              <w:rPr>
-                <w:rFonts w:ascii="Arial" w:hAnsi="Arial"/>
-                <w:b/>
-                <w:color w:val="4D1C21"/>
-                <w:sz w:val="20"/>
-                <w:lang w:val="pt-PT"/>
-              </w:rPr>
-              <w:t>serviço solicitado em ambos os casos chama-se '</w:t>
+              <w:t xml:space="preserve"> EXPLICAÇÃO: O serviço solicitado em ambos os casos chama-se '</w:t>
             </w:r>
             <w:proofErr w:type="spellStart"/>
             <w:r>
               <w:rPr>
-                <w:rFonts w:ascii="Arial" w:hAnsi="Arial"/>
+                <w:rFonts w:ascii="Arial" w:hAnsi="Arial" w:cs="Arial"/>
                 <w:b/>
                 <w:color w:val="4D1C21"/>
                 <w:sz w:val="20"/>
@@ -799,7 +835,7 @@
             <w:proofErr w:type="spellEnd"/>
             <w:r>
               <w:rPr>
-                <w:rFonts w:ascii="Arial" w:hAnsi="Arial"/>
+                <w:rFonts w:ascii="Arial" w:hAnsi="Arial" w:cs="Arial"/>
                 <w:b/>
                 <w:color w:val="4D1C21"/>
                 <w:sz w:val="20"/>
@@ -810,7 +846,7 @@
             <w:proofErr w:type="spellStart"/>
             <w:r>
               <w:rPr>
-                <w:rFonts w:ascii="Arial" w:hAnsi="Arial"/>
+                <w:rFonts w:ascii="Arial" w:hAnsi="Arial" w:cs="Arial"/>
                 <w:b/>
                 <w:color w:val="4D1C21"/>
                 <w:sz w:val="20"/>
@@ -821,7 +857,7 @@
             <w:proofErr w:type="spellEnd"/>
             <w:r>
               <w:rPr>
-                <w:rFonts w:ascii="Arial" w:hAnsi="Arial"/>
+                <w:rFonts w:ascii="Arial" w:hAnsi="Arial" w:cs="Arial"/>
                 <w:b/>
                 <w:color w:val="4D1C21"/>
                 <w:sz w:val="20"/>
@@ -837,6 +873,7 @@
       <w:pPr>
         <w:spacing w:before="200"/>
         <w:rPr>
+          <w:rFonts w:ascii="Arial" w:hAnsi="Arial" w:cs="Arial"/>
           <w:lang w:val="pt-PT"/>
         </w:rPr>
       </w:pPr>
@@ -846,21 +883,67 @@
         <w:keepNext/>
         <w:spacing w:before="280" w:after="120"/>
         <w:rPr>
+          <w:rFonts w:ascii="Arial" w:hAnsi="Arial" w:cs="Arial"/>
+          <w:b/>
+          <w:bCs/>
+          <w:color w:val="4D1C21"/>
+          <w:sz w:val="26"/>
+          <w:szCs w:val="26"/>
           <w:lang w:val="pt-PT"/>
         </w:rPr>
       </w:pPr>
       <w:r>
-        <w:t>2. Pagamento por Cartão Bancário &amp; Solução Global PayPal (Altamente Fidedigno)</w:t>
+        <w:rPr>
+          <w:rFonts w:ascii="Arial" w:hAnsi="Arial" w:cs="Arial"/>
+          <w:b/>
+          <w:bCs/>
+          <w:color w:val="4D1C21"/>
+          <w:sz w:val="26"/>
+          <w:szCs w:val="26"/>
+          <w:lang w:val="pt-PT"/>
+        </w:rPr>
+        <w:t xml:space="preserve">2. Pagamento por Cartão Bancário &amp; Solução Global </w:t>
+      </w:r>
+      <w:proofErr w:type="spellStart"/>
+      <w:r>
+        <w:rPr>
+          <w:rFonts w:ascii="Arial" w:hAnsi="Arial" w:cs="Arial"/>
+          <w:b/>
+          <w:bCs/>
+          <w:color w:val="4D1C21"/>
+          <w:sz w:val="26"/>
+          <w:szCs w:val="26"/>
+          <w:lang w:val="pt-PT"/>
+        </w:rPr>
+        <w:t>PayPal</w:t>
+      </w:r>
+      <w:proofErr w:type="spellEnd"/>
+      <w:r>
+        <w:rPr>
+          <w:rFonts w:ascii="Arial" w:hAnsi="Arial" w:cs="Arial"/>
+          <w:b/>
+          <w:bCs/>
+          <w:color w:val="4D1C21"/>
+          <w:sz w:val="26"/>
+          <w:szCs w:val="26"/>
+          <w:lang w:val="pt-PT"/>
+        </w:rPr>
+        <w:t xml:space="preserve"> (Altamente Fidedigno)</w:t>
       </w:r>
     </w:p>
     <w:p>
       <w:pPr>
         <w:spacing w:after="120"/>
         <w:rPr>
+          <w:rFonts w:ascii="Arial" w:hAnsi="Arial" w:cs="Arial"/>
           <w:lang w:val="pt-PT"/>
         </w:rPr>
       </w:pPr>
       <w:r>
+        <w:rPr>
+          <w:rFonts w:ascii="Arial" w:hAnsi="Arial" w:cs="Arial"/>
+          <w:lang w:val="pt-PT"/>
+        </w:rPr>
         <w:t>Para receber pagamentos por cartão e garantir a máxima fidedignidade, a OAGB dispõe agora de duas rotas principais de processamento:</w:t>
       </w:r>
     </w:p>
@@ -868,18 +951,159 @@
       <w:pPr>
         <w:spacing w:after="120"/>
         <w:rPr>
+          <w:rFonts w:ascii="Arial" w:hAnsi="Arial" w:cs="Arial"/>
           <w:lang w:val="pt-PT"/>
         </w:rPr>
       </w:pPr>
       <w:r>
-        <w:t>Rota A: Integração Oficial PayPal Business (Recomendada para Cartões e Fluxo Internacional)</w:t>
+        <w:rPr>
+          <w:rFonts w:ascii="Arial" w:hAnsi="Arial" w:cs="Arial"/>
+          <w:lang w:val="pt-PT"/>
+        </w:rPr>
+        <w:t xml:space="preserve">Rota A: Integração Oficial </w:t>
+      </w:r>
+      <w:proofErr w:type="spellStart"/>
+      <w:r>
+        <w:rPr>
+          <w:rFonts w:ascii="Arial" w:hAnsi="Arial" w:cs="Arial"/>
+          <w:lang w:val="pt-PT"/>
+        </w:rPr>
+        <w:t>PayPal</w:t>
+      </w:r>
+      <w:proofErr w:type="spellEnd"/>
+      <w:r>
+        <w:rPr>
+          <w:rFonts w:ascii="Arial" w:hAnsi="Arial" w:cs="Arial"/>
+          <w:lang w:val="pt-PT"/>
+        </w:rPr>
+        <w:t xml:space="preserve"> Business (Recomendada para Cartões e Fluxo Internacional)</w:t>
+      </w:r>
+      <w:r>
+        <w:rPr>
+          <w:rFonts w:ascii="Arial" w:hAnsi="Arial" w:cs="Arial"/>
+          <w:lang w:val="pt-PT"/>
+        </w:rPr>
         <w:br/>
-        <w:t>A Guiné-Bissau é listada oficialmente como elegível para contas PayPal comerciais. A OAGB pode criar uma conta comercial associada ao seu e-mail corporativo, permitindo aceitar cartões Visa, Mastercard e pagamentos diretos de forma imediata e sem intermediários regionais. Os fundos acumulados são transferidos diretamente para a conta bancária da Ordem.</w:t>
+        <w:t xml:space="preserve">A Guiné-Bissau é listada oficialmente como elegível para contas </w:t>
+      </w:r>
+      <w:proofErr w:type="spellStart"/>
+      <w:r>
+        <w:rPr>
+          <w:rFonts w:ascii="Arial" w:hAnsi="Arial" w:cs="Arial"/>
+          <w:lang w:val="pt-PT"/>
+        </w:rPr>
+        <w:t>PayPal</w:t>
+      </w:r>
+      <w:proofErr w:type="spellEnd"/>
+      <w:r>
+        <w:rPr>
+          <w:rFonts w:ascii="Arial" w:hAnsi="Arial" w:cs="Arial"/>
+          <w:lang w:val="pt-PT"/>
+        </w:rPr>
+        <w:t xml:space="preserve"> comerciais. A OAGB pode criar uma conta comercial associada ao seu e-mail corporativo, permitindo aceitar cartões Visa, </w:t>
+      </w:r>
+      <w:proofErr w:type="spellStart"/>
+      <w:r>
+        <w:rPr>
+          <w:rFonts w:ascii="Arial" w:hAnsi="Arial" w:cs="Arial"/>
+          <w:lang w:val="pt-PT"/>
+        </w:rPr>
+        <w:t>Mastercard</w:t>
+      </w:r>
+      <w:proofErr w:type="spellEnd"/>
+      <w:r>
+        <w:rPr>
+          <w:rFonts w:ascii="Arial" w:hAnsi="Arial" w:cs="Arial"/>
+          <w:lang w:val="pt-PT"/>
+        </w:rPr>
+        <w:t xml:space="preserve"> e pagamentos diretos de forma imediata e sem intermediários regionais. Os fundos acumulados são transferidos diretamente para a conta bancária da Ordem.</w:t>
+      </w:r>
+      <w:r>
+        <w:rPr>
+          <w:rFonts w:ascii="Arial" w:hAnsi="Arial" w:cs="Arial"/>
+          <w:lang w:val="pt-PT"/>
+        </w:rPr>
         <w:br/>
+      </w:r>
+      <w:r>
+        <w:rPr>
+          <w:rFonts w:ascii="Arial" w:hAnsi="Arial" w:cs="Arial"/>
+          <w:lang w:val="pt-PT"/>
+        </w:rPr>
         <w:br/>
-        <w:t>Rota B: Gateways Regionais UEMOA (FedaPay / CinetPay)</w:t>
+        <w:t>Rota B: Gateways Regionais UEMOA (</w:t>
+      </w:r>
+      <w:proofErr w:type="spellStart"/>
+      <w:r>
+        <w:rPr>
+          <w:rFonts w:ascii="Arial" w:hAnsi="Arial" w:cs="Arial"/>
+          <w:lang w:val="pt-PT"/>
+        </w:rPr>
+        <w:t>FedaPay</w:t>
+      </w:r>
+      <w:proofErr w:type="spellEnd"/>
+      <w:r>
+        <w:rPr>
+          <w:rFonts w:ascii="Arial" w:hAnsi="Arial" w:cs="Arial"/>
+          <w:lang w:val="pt-PT"/>
+        </w:rPr>
+        <w:t xml:space="preserve"> / </w:t>
+      </w:r>
+      <w:proofErr w:type="spellStart"/>
+      <w:r>
+        <w:rPr>
+          <w:rFonts w:ascii="Arial" w:hAnsi="Arial" w:cs="Arial"/>
+          <w:lang w:val="pt-PT"/>
+        </w:rPr>
+        <w:t>CinetPay</w:t>
+      </w:r>
+      <w:proofErr w:type="spellEnd"/>
+      <w:r>
+        <w:rPr>
+          <w:rFonts w:ascii="Arial" w:hAnsi="Arial" w:cs="Arial"/>
+          <w:lang w:val="pt-PT"/>
+        </w:rPr>
+        <w:t>)</w:t>
+      </w:r>
+      <w:r>
+        <w:rPr>
+          <w:rFonts w:ascii="Arial" w:hAnsi="Arial" w:cs="Arial"/>
+          <w:lang w:val="pt-PT"/>
+        </w:rPr>
         <w:br/>
-        <w:t>Processadores regionais licenciados operando na moeda oficial do país (Franco CFA - XOF) ligando bancos da rede GIM-UEMOA (como o BDU, BAO, Ecobank). O gateway processa os cartões locais e internacionais e transfere periodicamente para a conta local da OAGB na Guiné-Bissau.</w:t>
+        <w:t xml:space="preserve">Processadores regionais licenciados operando na moeda oficial do país (Franco CFA - XOF) ligando bancos da rede GIM-UEMOA (como o BDU, BAO, </w:t>
+      </w:r>
+      <w:proofErr w:type="spellStart"/>
+      <w:r>
+        <w:rPr>
+          <w:rFonts w:ascii="Arial" w:hAnsi="Arial" w:cs="Arial"/>
+          <w:lang w:val="pt-PT"/>
+        </w:rPr>
+        <w:t>Ecobank</w:t>
+      </w:r>
+      <w:proofErr w:type="spellEnd"/>
+      <w:r>
+        <w:rPr>
+          <w:rFonts w:ascii="Arial" w:hAnsi="Arial" w:cs="Arial"/>
+          <w:lang w:val="pt-PT"/>
+        </w:rPr>
+        <w:t xml:space="preserve">). O </w:t>
+      </w:r>
+      <w:proofErr w:type="spellStart"/>
+      <w:r>
+        <w:rPr>
+          <w:rFonts w:ascii="Arial" w:hAnsi="Arial" w:cs="Arial"/>
+          <w:lang w:val="pt-PT"/>
+        </w:rPr>
+        <w:t>gateway</w:t>
+      </w:r>
+      <w:proofErr w:type="spellEnd"/>
+      <w:r>
+        <w:rPr>
+          <w:rFonts w:ascii="Arial" w:hAnsi="Arial" w:cs="Arial"/>
+          <w:lang w:val="pt-PT"/>
+        </w:rPr>
+        <w:t xml:space="preserve"> processa os cartões locais e internacionais e transfere periodicamente para a conta local da OAGB na Guiné-Bissau.</w:t>
       </w:r>
     </w:p>
     <w:p>
@@ -887,12 +1111,13 @@
         <w:keepNext/>
         <w:spacing w:before="280" w:after="120"/>
         <w:rPr>
+          <w:rFonts w:ascii="Arial" w:hAnsi="Arial" w:cs="Arial"/>
           <w:lang w:val="pt-PT"/>
         </w:rPr>
       </w:pPr>
       <w:r>
         <w:rPr>
-          <w:rFonts w:ascii="Arial" w:hAnsi="Arial"/>
+          <w:rFonts w:ascii="Arial" w:hAnsi="Arial" w:cs="Arial"/>
           <w:b/>
           <w:color w:val="B1A276"/>
           <w:sz w:val="23"/>
@@ -905,12 +1130,13 @@
       <w:pPr>
         <w:spacing w:after="120"/>
         <w:rPr>
+          <w:rFonts w:ascii="Arial" w:hAnsi="Arial" w:cs="Arial"/>
           <w:lang w:val="pt-PT"/>
         </w:rPr>
       </w:pPr>
       <w:r>
         <w:rPr>
-          <w:rFonts w:ascii="Arial" w:hAnsi="Arial"/>
+          <w:rFonts w:ascii="Arial" w:hAnsi="Arial" w:cs="Arial"/>
           <w:color w:val="1E1E1E"/>
           <w:lang w:val="pt-PT"/>
         </w:rPr>
@@ -919,7 +1145,7 @@
       <w:proofErr w:type="spellStart"/>
       <w:r>
         <w:rPr>
-          <w:rFonts w:ascii="Arial" w:hAnsi="Arial"/>
+          <w:rFonts w:ascii="Arial" w:hAnsi="Arial" w:cs="Arial"/>
           <w:color w:val="1E1E1E"/>
           <w:lang w:val="pt-PT"/>
         </w:rPr>
@@ -928,7 +1154,7 @@
       <w:proofErr w:type="spellEnd"/>
       <w:r>
         <w:rPr>
-          <w:rFonts w:ascii="Arial" w:hAnsi="Arial"/>
+          <w:rFonts w:ascii="Arial" w:hAnsi="Arial" w:cs="Arial"/>
           <w:color w:val="1E1E1E"/>
           <w:lang w:val="pt-PT"/>
         </w:rPr>
@@ -936,7 +1162,7 @@
       </w:r>
       <w:r>
         <w:rPr>
-          <w:rFonts w:ascii="Arial" w:hAnsi="Arial"/>
+          <w:rFonts w:ascii="Arial" w:hAnsi="Arial" w:cs="Arial"/>
           <w:color w:val="1E1E1E"/>
           <w:lang w:val="pt-PT"/>
         </w:rPr>
@@ -946,7 +1172,7 @@
       <w:proofErr w:type="spellStart"/>
       <w:r>
         <w:rPr>
-          <w:rFonts w:ascii="Arial" w:hAnsi="Arial"/>
+          <w:rFonts w:ascii="Arial" w:hAnsi="Arial" w:cs="Arial"/>
           <w:color w:val="1E1E1E"/>
           <w:lang w:val="pt-PT"/>
         </w:rPr>
@@ -955,7 +1181,7 @@
       <w:proofErr w:type="spellEnd"/>
       <w:r>
         <w:rPr>
-          <w:rFonts w:ascii="Arial" w:hAnsi="Arial"/>
+          <w:rFonts w:ascii="Arial" w:hAnsi="Arial" w:cs="Arial"/>
           <w:color w:val="1E1E1E"/>
           <w:lang w:val="pt-PT"/>
         </w:rPr>
@@ -967,12 +1193,13 @@
         <w:keepNext/>
         <w:spacing w:before="280" w:after="120"/>
         <w:rPr>
+          <w:rFonts w:ascii="Arial" w:hAnsi="Arial" w:cs="Arial"/>
           <w:lang w:val="pt-PT"/>
         </w:rPr>
       </w:pPr>
       <w:r>
         <w:rPr>
-          <w:rFonts w:ascii="Arial" w:hAnsi="Arial"/>
+          <w:rFonts w:ascii="Arial" w:hAnsi="Arial" w:cs="Arial"/>
           <w:b/>
           <w:color w:val="B1A276"/>
           <w:sz w:val="23"/>
@@ -985,12 +1212,13 @@
       <w:pPr>
         <w:spacing w:after="120"/>
         <w:rPr>
+          <w:rFonts w:ascii="Arial" w:hAnsi="Arial" w:cs="Arial"/>
           <w:lang w:val="pt-PT"/>
         </w:rPr>
       </w:pPr>
       <w:r>
         <w:rPr>
-          <w:rFonts w:ascii="Arial" w:hAnsi="Arial"/>
+          <w:rFonts w:ascii="Arial" w:hAnsi="Arial" w:cs="Arial"/>
           <w:color w:val="1E1E1E"/>
           <w:lang w:val="pt-PT"/>
         </w:rPr>
@@ -998,7 +1226,7 @@
       </w:r>
       <w:r>
         <w:rPr>
-          <w:rFonts w:ascii="Arial" w:hAnsi="Arial"/>
+          <w:rFonts w:ascii="Arial" w:hAnsi="Arial" w:cs="Arial"/>
           <w:color w:val="1E1E1E"/>
           <w:lang w:val="pt-PT"/>
         </w:rPr>
@@ -1008,7 +1236,7 @@
       <w:proofErr w:type="spellStart"/>
       <w:r>
         <w:rPr>
-          <w:rFonts w:ascii="Arial" w:hAnsi="Arial"/>
+          <w:rFonts w:ascii="Arial" w:hAnsi="Arial" w:cs="Arial"/>
           <w:color w:val="1E1E1E"/>
           <w:lang w:val="pt-PT"/>
         </w:rPr>
@@ -1017,7 +1245,7 @@
       <w:proofErr w:type="spellEnd"/>
       <w:r>
         <w:rPr>
-          <w:rFonts w:ascii="Arial" w:hAnsi="Arial"/>
+          <w:rFonts w:ascii="Arial" w:hAnsi="Arial" w:cs="Arial"/>
           <w:color w:val="1E1E1E"/>
           <w:lang w:val="pt-PT"/>
         </w:rPr>
@@ -1026,7 +1254,7 @@
       <w:proofErr w:type="spellStart"/>
       <w:r>
         <w:rPr>
-          <w:rFonts w:ascii="Arial" w:hAnsi="Arial"/>
+          <w:rFonts w:ascii="Arial" w:hAnsi="Arial" w:cs="Arial"/>
           <w:color w:val="1E1E1E"/>
           <w:lang w:val="pt-PT"/>
         </w:rPr>
@@ -1035,23 +1263,15 @@
       <w:proofErr w:type="spellEnd"/>
       <w:r>
         <w:rPr>
-          <w:rFonts w:ascii="Arial" w:hAnsi="Arial"/>
+          <w:rFonts w:ascii="Arial" w:hAnsi="Arial" w:cs="Arial"/>
           <w:color w:val="1E1E1E"/>
           <w:lang w:val="pt-PT"/>
         </w:rPr>
-        <w:t>) processa com segura</w:t>
+        <w:t>) processa com segurança</w:t>
       </w:r>
       <w:r>
         <w:rPr>
-          <w:rFonts w:ascii="Arial" w:hAnsi="Arial"/>
-          <w:color w:val="1E1E1E"/>
-          <w:lang w:val="pt-PT"/>
-        </w:rPr>
-        <w:t>nça</w:t>
-      </w:r>
-      <w:r>
-        <w:rPr>
-          <w:rFonts w:ascii="Arial" w:hAnsi="Arial"/>
+          <w:rFonts w:ascii="Arial" w:hAnsi="Arial" w:cs="Arial"/>
           <w:color w:val="1E1E1E"/>
           <w:lang w:val="pt-PT"/>
         </w:rPr>
@@ -1061,7 +1281,7 @@
       <w:proofErr w:type="spellStart"/>
       <w:r>
         <w:rPr>
-          <w:rFonts w:ascii="Arial" w:hAnsi="Arial"/>
+          <w:rFonts w:ascii="Arial" w:hAnsi="Arial" w:cs="Arial"/>
           <w:color w:val="1E1E1E"/>
           <w:lang w:val="pt-PT"/>
         </w:rPr>
@@ -1070,7 +1290,7 @@
       <w:proofErr w:type="spellEnd"/>
       <w:r>
         <w:rPr>
-          <w:rFonts w:ascii="Arial" w:hAnsi="Arial"/>
+          <w:rFonts w:ascii="Arial" w:hAnsi="Arial" w:cs="Arial"/>
           <w:color w:val="1E1E1E"/>
           <w:lang w:val="pt-PT"/>
         </w:rPr>
@@ -1081,14 +1301,14 @@
       <w:pPr>
         <w:spacing w:after="120"/>
         <w:rPr>
-          <w:rFonts w:ascii="Arial" w:hAnsi="Arial"/>
+          <w:rFonts w:ascii="Arial" w:hAnsi="Arial" w:cs="Arial"/>
           <w:color w:val="1E1E1E"/>
           <w:lang w:val="pt-PT"/>
         </w:rPr>
       </w:pPr>
       <w:r>
         <w:rPr>
-          <w:rFonts w:ascii="Arial" w:hAnsi="Arial"/>
+          <w:rFonts w:ascii="Arial" w:hAnsi="Arial" w:cs="Arial"/>
           <w:color w:val="1E1E1E"/>
           <w:lang w:val="pt-PT"/>
         </w:rPr>
@@ -1097,7 +1317,7 @@
       <w:proofErr w:type="spellStart"/>
       <w:r>
         <w:rPr>
-          <w:rFonts w:ascii="Arial" w:hAnsi="Arial"/>
+          <w:rFonts w:ascii="Arial" w:hAnsi="Arial" w:cs="Arial"/>
           <w:color w:val="1E1E1E"/>
           <w:lang w:val="pt-PT"/>
         </w:rPr>
@@ -1106,7 +1326,7 @@
       <w:proofErr w:type="spellEnd"/>
       <w:r>
         <w:rPr>
-          <w:rFonts w:ascii="Arial" w:hAnsi="Arial"/>
+          <w:rFonts w:ascii="Arial" w:hAnsi="Arial" w:cs="Arial"/>
           <w:color w:val="1E1E1E"/>
           <w:lang w:val="pt-PT"/>
         </w:rPr>
@@ -1115,7 +1335,7 @@
       <w:proofErr w:type="spellStart"/>
       <w:r>
         <w:rPr>
-          <w:rFonts w:ascii="Arial" w:hAnsi="Arial"/>
+          <w:rFonts w:ascii="Arial" w:hAnsi="Arial" w:cs="Arial"/>
           <w:color w:val="1E1E1E"/>
           <w:lang w:val="pt-PT"/>
         </w:rPr>
@@ -1124,7 +1344,7 @@
       <w:proofErr w:type="spellEnd"/>
       <w:r>
         <w:rPr>
-          <w:rFonts w:ascii="Arial" w:hAnsi="Arial"/>
+          <w:rFonts w:ascii="Arial" w:hAnsi="Arial" w:cs="Arial"/>
           <w:color w:val="1E1E1E"/>
           <w:lang w:val="pt-PT"/>
         </w:rPr>
@@ -1133,7 +1353,7 @@
       <w:proofErr w:type="spellStart"/>
       <w:r>
         <w:rPr>
-          <w:rFonts w:ascii="Arial" w:hAnsi="Arial"/>
+          <w:rFonts w:ascii="Arial" w:hAnsi="Arial" w:cs="Arial"/>
           <w:color w:val="1E1E1E"/>
           <w:lang w:val="pt-PT"/>
         </w:rPr>
@@ -1142,7 +1362,7 @@
       <w:proofErr w:type="spellEnd"/>
       <w:r>
         <w:rPr>
-          <w:rFonts w:ascii="Arial" w:hAnsi="Arial"/>
+          <w:rFonts w:ascii="Arial" w:hAnsi="Arial" w:cs="Arial"/>
           <w:color w:val="1E1E1E"/>
           <w:lang w:val="pt-PT"/>
         </w:rPr>
@@ -1151,7 +1371,7 @@
       <w:proofErr w:type="spellStart"/>
       <w:r>
         <w:rPr>
-          <w:rFonts w:ascii="Arial" w:hAnsi="Arial"/>
+          <w:rFonts w:ascii="Arial" w:hAnsi="Arial" w:cs="Arial"/>
           <w:color w:val="1E1E1E"/>
           <w:lang w:val="pt-PT"/>
         </w:rPr>
@@ -1160,23 +1380,24 @@
       <w:proofErr w:type="spellEnd"/>
       <w:r>
         <w:rPr>
-          <w:rFonts w:ascii="Arial" w:hAnsi="Arial"/>
+          <w:rFonts w:ascii="Arial" w:hAnsi="Arial" w:cs="Arial"/>
           <w:color w:val="1E1E1E"/>
           <w:lang w:val="pt-PT"/>
         </w:rPr>
-        <w:t xml:space="preserve">) e submete os seus documentos legais (Registo da Ordem, NIF, </w:t>
+        <w:t xml:space="preserve">) e submete os seus documentos legais (Registo da Ordem, NIF, IBAN da conta </w:t>
       </w:r>
       <w:r>
         <w:rPr>
-          <w:rFonts w:ascii="Arial" w:hAnsi="Arial"/>
+          <w:rFonts w:ascii="Arial" w:hAnsi="Arial" w:cs="Arial"/>
           <w:color w:val="1E1E1E"/>
           <w:lang w:val="pt-PT"/>
         </w:rPr>
-        <w:t>IBAN da conta bancária local).</w:t>
+        <w:lastRenderedPageBreak/>
+        <w:t>bancária local).</w:t>
       </w:r>
       <w:r>
         <w:rPr>
-          <w:rFonts w:ascii="Arial" w:hAnsi="Arial"/>
+          <w:rFonts w:ascii="Arial" w:hAnsi="Arial" w:cs="Arial"/>
           <w:color w:val="1E1E1E"/>
           <w:lang w:val="pt-PT"/>
         </w:rPr>
@@ -1186,7 +1407,7 @@
       <w:proofErr w:type="spellStart"/>
       <w:r>
         <w:rPr>
-          <w:rFonts w:ascii="Arial" w:hAnsi="Arial"/>
+          <w:rFonts w:ascii="Arial" w:hAnsi="Arial" w:cs="Arial"/>
           <w:color w:val="1E1E1E"/>
           <w:lang w:val="pt-PT"/>
         </w:rPr>
@@ -1195,7 +1416,7 @@
       <w:proofErr w:type="spellEnd"/>
       <w:r>
         <w:rPr>
-          <w:rFonts w:ascii="Arial" w:hAnsi="Arial"/>
+          <w:rFonts w:ascii="Arial" w:hAnsi="Arial" w:cs="Arial"/>
           <w:color w:val="1E1E1E"/>
           <w:lang w:val="pt-PT"/>
         </w:rPr>
@@ -1204,7 +1425,7 @@
       <w:proofErr w:type="spellStart"/>
       <w:r>
         <w:rPr>
-          <w:rFonts w:ascii="Arial" w:hAnsi="Arial"/>
+          <w:rFonts w:ascii="Arial" w:hAnsi="Arial" w:cs="Arial"/>
           <w:color w:val="1E1E1E"/>
           <w:lang w:val="pt-PT"/>
         </w:rPr>
@@ -1213,7 +1434,7 @@
       <w:proofErr w:type="spellEnd"/>
       <w:r>
         <w:rPr>
-          <w:rFonts w:ascii="Arial" w:hAnsi="Arial"/>
+          <w:rFonts w:ascii="Arial" w:hAnsi="Arial" w:cs="Arial"/>
           <w:color w:val="1E1E1E"/>
           <w:lang w:val="pt-PT"/>
         </w:rPr>
@@ -1221,7 +1442,7 @@
       </w:r>
       <w:r>
         <w:rPr>
-          <w:rFonts w:ascii="Arial" w:hAnsi="Arial"/>
+          <w:rFonts w:ascii="Arial" w:hAnsi="Arial" w:cs="Arial"/>
           <w:color w:val="1E1E1E"/>
           <w:lang w:val="pt-PT"/>
         </w:rPr>
@@ -1231,7 +1452,7 @@
       <w:proofErr w:type="spellStart"/>
       <w:r>
         <w:rPr>
-          <w:rFonts w:ascii="Arial" w:hAnsi="Arial"/>
+          <w:rFonts w:ascii="Arial" w:hAnsi="Arial" w:cs="Arial"/>
           <w:color w:val="1E1E1E"/>
           <w:lang w:val="pt-PT"/>
         </w:rPr>
@@ -1240,7 +1461,7 @@
       <w:proofErr w:type="spellEnd"/>
       <w:r>
         <w:rPr>
-          <w:rFonts w:ascii="Arial" w:hAnsi="Arial"/>
+          <w:rFonts w:ascii="Arial" w:hAnsi="Arial" w:cs="Arial"/>
           <w:color w:val="1E1E1E"/>
           <w:lang w:val="pt-PT"/>
         </w:rPr>
@@ -1249,24 +1470,16 @@
       <w:proofErr w:type="spellStart"/>
       <w:r>
         <w:rPr>
-          <w:rFonts w:ascii="Arial" w:hAnsi="Arial"/>
+          <w:rFonts w:ascii="Arial" w:hAnsi="Arial" w:cs="Arial"/>
           <w:color w:val="1E1E1E"/>
           <w:lang w:val="pt-PT"/>
         </w:rPr>
-        <w:t>g</w:t>
-      </w:r>
-      <w:r>
-        <w:rPr>
-          <w:rFonts w:ascii="Arial" w:hAnsi="Arial"/>
-          <w:color w:val="1E1E1E"/>
-          <w:lang w:val="pt-PT"/>
-        </w:rPr>
-        <w:t>ateway</w:t>
+        <w:t>gateway</w:t>
       </w:r>
       <w:proofErr w:type="spellEnd"/>
       <w:r>
         <w:rPr>
-          <w:rFonts w:ascii="Arial" w:hAnsi="Arial"/>
+          <w:rFonts w:ascii="Arial" w:hAnsi="Arial" w:cs="Arial"/>
           <w:color w:val="1E1E1E"/>
           <w:lang w:val="pt-PT"/>
         </w:rPr>
@@ -1275,7 +1488,7 @@
       <w:proofErr w:type="spellStart"/>
       <w:r>
         <w:rPr>
-          <w:rFonts w:ascii="Arial" w:hAnsi="Arial"/>
+          <w:rFonts w:ascii="Arial" w:hAnsi="Arial" w:cs="Arial"/>
           <w:color w:val="1E1E1E"/>
           <w:lang w:val="pt-PT"/>
         </w:rPr>
@@ -1284,7 +1497,7 @@
       <w:proofErr w:type="spellEnd"/>
       <w:r>
         <w:rPr>
-          <w:rFonts w:ascii="Arial" w:hAnsi="Arial"/>
+          <w:rFonts w:ascii="Arial" w:hAnsi="Arial" w:cs="Arial"/>
           <w:color w:val="1E1E1E"/>
           <w:lang w:val="pt-PT"/>
         </w:rPr>
@@ -1295,7 +1508,7 @@
       <w:pPr>
         <w:spacing w:after="120"/>
         <w:rPr>
-          <w:rFonts w:ascii="Arial" w:hAnsi="Arial"/>
+          <w:rFonts w:ascii="Arial" w:hAnsi="Arial" w:cs="Arial"/>
           <w:color w:val="1E1E1E"/>
           <w:lang w:val="pt-PT"/>
         </w:rPr>
@@ -1305,21 +1518,20 @@
       <w:pPr>
         <w:spacing w:after="120"/>
         <w:rPr>
-          <w:rFonts w:ascii="Arial" w:hAnsi="Arial"/>
+          <w:rFonts w:ascii="Arial" w:hAnsi="Arial" w:cs="Arial"/>
           <w:color w:val="1E1E1E"/>
           <w:lang w:val="pt-PT"/>
         </w:rPr>
       </w:pPr>
       <w:r>
         <w:rPr>
-          <w:rFonts w:ascii="Arial" w:hAnsi="Arial"/>
+          <w:rFonts w:ascii="Arial" w:hAnsi="Arial" w:cs="Arial"/>
           <w:noProof/>
           <w:color w:val="1E1E1E"/>
           <w:lang w:val="pt-PT"/>
         </w:rPr>
-        <w:lastRenderedPageBreak/>
         <w:drawing>
-          <wp:inline distT="0" distB="0" distL="0" distR="0" wp14:anchorId="5E635C2D" wp14:editId="02846C6C">
+          <wp:inline distT="0" distB="0" distL="0" distR="0" wp14:anchorId="431A7B5B" wp14:editId="69FB20CE">
             <wp:extent cx="5943600" cy="4295775"/>
             <wp:effectExtent l="0" t="0" r="0" b="9525"/>
             <wp:docPr id="1" name="Imagem 1"/>
@@ -1383,8 +1595,166 @@
             </w:tcMar>
           </w:tcPr>
           <w:p>
+            <w:pPr>
+              <w:rPr>
+                <w:rFonts w:ascii="Arial" w:hAnsi="Arial" w:cs="Arial"/>
+                <w:lang w:val="pt-PT"/>
+              </w:rPr>
+            </w:pPr>
             <w:r>
-              <w:t>📌 VANTAGEM ADICIONAL DO GATEWAY REGIONAL: Se a OAGB preferir simplificar os processos burocráticos, gateways como o PayPal, FedaPay e o CinetPay oferecem robustez máxima. Com o PayPal, a OAGB ganha credibilidade internacional imediata, enquanto gateways regionais agregam o Orange Money e o MTN MoMo da zona UEMOA. Isso significa que a OAGB pode fazer um único contrato com o gateway regional e passar a aceitar Cartão, Orange e MTN de uma só vez, centralizando todos os recebimentos numa única plataforma.</w:t>
+              <w:rPr>
+                <w:rFonts w:ascii="Segoe UI Emoji" w:hAnsi="Segoe UI Emoji" w:cs="Segoe UI Emoji"/>
+              </w:rPr>
+              <w:t>📌</w:t>
+            </w:r>
+            <w:r>
+              <w:rPr>
+                <w:rFonts w:ascii="Arial" w:hAnsi="Arial" w:cs="Arial"/>
+                <w:lang w:val="pt-PT"/>
+              </w:rPr>
+              <w:t xml:space="preserve"> VANTAGEM ADICIONAL DO GATEWAY REGIONAL: Se a OAGB preferir simplificar os processos burocráticos, </w:t>
+            </w:r>
+            <w:proofErr w:type="spellStart"/>
+            <w:r>
+              <w:rPr>
+                <w:rFonts w:ascii="Arial" w:hAnsi="Arial" w:cs="Arial"/>
+                <w:lang w:val="pt-PT"/>
+              </w:rPr>
+              <w:t>gateways</w:t>
+            </w:r>
+            <w:proofErr w:type="spellEnd"/>
+            <w:r>
+              <w:rPr>
+                <w:rFonts w:ascii="Arial" w:hAnsi="Arial" w:cs="Arial"/>
+                <w:lang w:val="pt-PT"/>
+              </w:rPr>
+              <w:t xml:space="preserve"> como o </w:t>
+            </w:r>
+            <w:proofErr w:type="spellStart"/>
+            <w:r>
+              <w:rPr>
+                <w:rFonts w:ascii="Arial" w:hAnsi="Arial" w:cs="Arial"/>
+                <w:lang w:val="pt-PT"/>
+              </w:rPr>
+              <w:t>PayPal</w:t>
+            </w:r>
+            <w:proofErr w:type="spellEnd"/>
+            <w:r>
+              <w:rPr>
+                <w:rFonts w:ascii="Arial" w:hAnsi="Arial" w:cs="Arial"/>
+                <w:lang w:val="pt-PT"/>
+              </w:rPr>
+              <w:t xml:space="preserve">, </w:t>
+            </w:r>
+            <w:proofErr w:type="spellStart"/>
+            <w:r>
+              <w:rPr>
+                <w:rFonts w:ascii="Arial" w:hAnsi="Arial" w:cs="Arial"/>
+                <w:lang w:val="pt-PT"/>
+              </w:rPr>
+              <w:t>FedaPay</w:t>
+            </w:r>
+            <w:proofErr w:type="spellEnd"/>
+            <w:r>
+              <w:rPr>
+                <w:rFonts w:ascii="Arial" w:hAnsi="Arial" w:cs="Arial"/>
+                <w:lang w:val="pt-PT"/>
+              </w:rPr>
+              <w:t xml:space="preserve"> e o </w:t>
+            </w:r>
+            <w:proofErr w:type="spellStart"/>
+            <w:r>
+              <w:rPr>
+                <w:rFonts w:ascii="Arial" w:hAnsi="Arial" w:cs="Arial"/>
+                <w:lang w:val="pt-PT"/>
+              </w:rPr>
+              <w:t>CinetPay</w:t>
+            </w:r>
+            <w:proofErr w:type="spellEnd"/>
+            <w:r>
+              <w:rPr>
+                <w:rFonts w:ascii="Arial" w:hAnsi="Arial" w:cs="Arial"/>
+                <w:lang w:val="pt-PT"/>
+              </w:rPr>
+              <w:t xml:space="preserve"> oferecem robuste</w:t>
+            </w:r>
+            <w:r>
+              <w:rPr>
+                <w:rFonts w:ascii="Arial" w:hAnsi="Arial" w:cs="Arial"/>
+                <w:lang w:val="pt-PT"/>
+              </w:rPr>
+              <w:t xml:space="preserve">z máxima. Com o </w:t>
+            </w:r>
+            <w:proofErr w:type="spellStart"/>
+            <w:r>
+              <w:rPr>
+                <w:rFonts w:ascii="Arial" w:hAnsi="Arial" w:cs="Arial"/>
+                <w:lang w:val="pt-PT"/>
+              </w:rPr>
+              <w:t>PayPal</w:t>
+            </w:r>
+            <w:proofErr w:type="spellEnd"/>
+            <w:r>
+              <w:rPr>
+                <w:rFonts w:ascii="Arial" w:hAnsi="Arial" w:cs="Arial"/>
+                <w:lang w:val="pt-PT"/>
+              </w:rPr>
+              <w:t xml:space="preserve">, a OAGB ganha credibilidade internacional imediata, enquanto </w:t>
+            </w:r>
+            <w:proofErr w:type="spellStart"/>
+            <w:r>
+              <w:rPr>
+                <w:rFonts w:ascii="Arial" w:hAnsi="Arial" w:cs="Arial"/>
+                <w:lang w:val="pt-PT"/>
+              </w:rPr>
+              <w:t>gateways</w:t>
+            </w:r>
+            <w:proofErr w:type="spellEnd"/>
+            <w:r>
+              <w:rPr>
+                <w:rFonts w:ascii="Arial" w:hAnsi="Arial" w:cs="Arial"/>
+                <w:lang w:val="pt-PT"/>
+              </w:rPr>
+              <w:t xml:space="preserve"> regionais agregam o Orange Money e o MTN </w:t>
+            </w:r>
+            <w:proofErr w:type="spellStart"/>
+            <w:r>
+              <w:rPr>
+                <w:rFonts w:ascii="Arial" w:hAnsi="Arial" w:cs="Arial"/>
+                <w:lang w:val="pt-PT"/>
+              </w:rPr>
+              <w:t>MoMo</w:t>
+            </w:r>
+            <w:proofErr w:type="spellEnd"/>
+            <w:r>
+              <w:rPr>
+                <w:rFonts w:ascii="Arial" w:hAnsi="Arial" w:cs="Arial"/>
+                <w:lang w:val="pt-PT"/>
+              </w:rPr>
+              <w:t xml:space="preserve"> da zona UEMOA. Isso significa que a OAGB pode fazer um único contrato com o </w:t>
+            </w:r>
+            <w:proofErr w:type="spellStart"/>
+            <w:r>
+              <w:rPr>
+                <w:rFonts w:ascii="Arial" w:hAnsi="Arial" w:cs="Arial"/>
+                <w:lang w:val="pt-PT"/>
+              </w:rPr>
+              <w:t>gateway</w:t>
+            </w:r>
+            <w:proofErr w:type="spellEnd"/>
+            <w:r>
+              <w:rPr>
+                <w:rFonts w:ascii="Arial" w:hAnsi="Arial" w:cs="Arial"/>
+                <w:lang w:val="pt-PT"/>
+              </w:rPr>
+              <w:t xml:space="preserve"> regional e passar a aceitar Cartã</w:t>
+            </w:r>
+            <w:r>
+              <w:rPr>
+                <w:rFonts w:ascii="Arial" w:hAnsi="Arial" w:cs="Arial"/>
+                <w:lang w:val="pt-PT"/>
+              </w:rPr>
+              <w:t>o, Orange e MTN de uma só vez, centralizando todos os recebimentos numa única plataforma.</w:t>
             </w:r>
           </w:p>
         </w:tc>
@@ -1394,6 +1764,7 @@
       <w:pPr>
         <w:spacing w:before="240"/>
         <w:rPr>
+          <w:rFonts w:ascii="Arial" w:hAnsi="Arial" w:cs="Arial"/>
           <w:lang w:val="pt-PT"/>
         </w:rPr>
       </w:pPr>
@@ -1403,17 +1774,19 @@
         <w:keepNext/>
         <w:spacing w:before="280" w:after="120"/>
         <w:rPr>
+          <w:rFonts w:ascii="Arial" w:hAnsi="Arial" w:cs="Arial"/>
           <w:lang w:val="pt-PT"/>
         </w:rPr>
       </w:pPr>
       <w:r>
         <w:rPr>
-          <w:rFonts w:ascii="Arial" w:hAnsi="Arial"/>
+          <w:rFonts w:ascii="Arial" w:hAnsi="Arial" w:cs="Arial"/>
           <w:b/>
           <w:color w:val="4D1C21"/>
           <w:sz w:val="26"/>
           <w:lang w:val="pt-PT"/>
         </w:rPr>
+        <w:lastRenderedPageBreak/>
         <w:t>3. Plano de Ação Imediato para a OAGB</w:t>
       </w:r>
     </w:p>
@@ -1421,12 +1794,13 @@
       <w:pPr>
         <w:spacing w:after="120"/>
         <w:rPr>
+          <w:rFonts w:ascii="Arial" w:hAnsi="Arial" w:cs="Arial"/>
           <w:lang w:val="pt-PT"/>
         </w:rPr>
       </w:pPr>
       <w:r>
         <w:rPr>
-          <w:rFonts w:ascii="Arial" w:hAnsi="Arial"/>
+          <w:rFonts w:ascii="Arial" w:hAnsi="Arial" w:cs="Arial"/>
           <w:color w:val="1E1E1E"/>
           <w:lang w:val="pt-PT"/>
         </w:rPr>
@@ -1470,7 +1844,15 @@
             </w:tcMar>
           </w:tcPr>
           <w:p>
+            <w:pPr>
+              <w:rPr>
+                <w:rFonts w:ascii="Arial" w:hAnsi="Arial" w:cs="Arial"/>
+              </w:rPr>
+            </w:pPr>
             <w:r>
+              <w:rPr>
+                <w:rFonts w:ascii="Arial" w:hAnsi="Arial" w:cs="Arial"/>
+              </w:rPr>
               <w:t>Etapa</w:t>
             </w:r>
           </w:p>
@@ -1487,7 +1869,15 @@
             </w:tcMar>
           </w:tcPr>
           <w:p>
+            <w:pPr>
+              <w:rPr>
+                <w:rFonts w:ascii="Arial" w:hAnsi="Arial" w:cs="Arial"/>
+              </w:rPr>
+            </w:pPr>
             <w:r>
+              <w:rPr>
+                <w:rFonts w:ascii="Arial" w:hAnsi="Arial" w:cs="Arial"/>
+              </w:rPr>
               <w:t>Ação</w:t>
             </w:r>
           </w:p>
@@ -1504,7 +1894,15 @@
             </w:tcMar>
           </w:tcPr>
           <w:p>
+            <w:pPr>
+              <w:rPr>
+                <w:rFonts w:ascii="Arial" w:hAnsi="Arial" w:cs="Arial"/>
+              </w:rPr>
+            </w:pPr>
             <w:r>
+              <w:rPr>
+                <w:rFonts w:ascii="Arial" w:hAnsi="Arial" w:cs="Arial"/>
+              </w:rPr>
               <w:t>Responsável</w:t>
             </w:r>
           </w:p>
@@ -1521,8 +1919,22 @@
             </w:tcMar>
           </w:tcPr>
           <w:p>
+            <w:pPr>
+              <w:rPr>
+                <w:rFonts w:ascii="Arial" w:hAnsi="Arial" w:cs="Arial"/>
+              </w:rPr>
+            </w:pPr>
             <w:r>
-              <w:t>Status Sugerido</w:t>
+              <w:rPr>
+                <w:rFonts w:ascii="Arial" w:hAnsi="Arial" w:cs="Arial"/>
+              </w:rPr>
+              <w:t xml:space="preserve">Status </w:t>
+            </w:r>
+            <w:r>
+              <w:rPr>
+                <w:rFonts w:ascii="Arial" w:hAnsi="Arial" w:cs="Arial"/>
+              </w:rPr>
+              <w:t>Sugerido</w:t>
             </w:r>
           </w:p>
         </w:tc>
@@ -1543,7 +1955,15 @@
             </w:tcMar>
           </w:tcPr>
           <w:p>
+            <w:pPr>
+              <w:rPr>
+                <w:rFonts w:ascii="Arial" w:hAnsi="Arial" w:cs="Arial"/>
+              </w:rPr>
+            </w:pPr>
             <w:r>
+              <w:rPr>
+                <w:rFonts w:ascii="Arial" w:hAnsi="Arial" w:cs="Arial"/>
+              </w:rPr>
               <w:t>1</w:t>
             </w:r>
           </w:p>
@@ -1560,8 +1980,50 @@
             </w:tcMar>
           </w:tcPr>
           <w:p>
+            <w:pPr>
+              <w:rPr>
+                <w:rFonts w:ascii="Arial" w:hAnsi="Arial" w:cs="Arial"/>
+                <w:lang w:val="pt-PT"/>
+              </w:rPr>
+            </w:pPr>
             <w:r>
-              <w:t>Enviar ofício formal à Orange Bissau e MTN Bissau solicitando credenciais de produção de Collections API/USSD Push.</w:t>
+              <w:rPr>
+                <w:rFonts w:ascii="Arial" w:hAnsi="Arial" w:cs="Arial"/>
+                <w:lang w:val="pt-PT"/>
+              </w:rPr>
+              <w:t xml:space="preserve">Enviar ofício formal à Orange Bissau e MTN Bissau solicitando credenciais de produção de </w:t>
+            </w:r>
+            <w:proofErr w:type="spellStart"/>
+            <w:r>
+              <w:rPr>
+                <w:rFonts w:ascii="Arial" w:hAnsi="Arial" w:cs="Arial"/>
+                <w:lang w:val="pt-PT"/>
+              </w:rPr>
+              <w:t>Collections</w:t>
+            </w:r>
+            <w:proofErr w:type="spellEnd"/>
+            <w:r>
+              <w:rPr>
+                <w:rFonts w:ascii="Arial" w:hAnsi="Arial" w:cs="Arial"/>
+                <w:lang w:val="pt-PT"/>
+              </w:rPr>
+              <w:t xml:space="preserve"> API/USSD </w:t>
+            </w:r>
+            <w:proofErr w:type="spellStart"/>
+            <w:r>
+              <w:rPr>
+                <w:rFonts w:ascii="Arial" w:hAnsi="Arial" w:cs="Arial"/>
+                <w:lang w:val="pt-PT"/>
+              </w:rPr>
+              <w:t>Push</w:t>
+            </w:r>
+            <w:proofErr w:type="spellEnd"/>
+            <w:r>
+              <w:rPr>
+                <w:rFonts w:ascii="Arial" w:hAnsi="Arial" w:cs="Arial"/>
+                <w:lang w:val="pt-PT"/>
+              </w:rPr>
+              <w:t>.</w:t>
             </w:r>
           </w:p>
         </w:tc>
@@ -1577,8 +2039,24 @@
             </w:tcMar>
           </w:tcPr>
           <w:p>
+            <w:pPr>
+              <w:rPr>
+                <w:rFonts w:ascii="Arial" w:hAnsi="Arial" w:cs="Arial"/>
+              </w:rPr>
+            </w:pPr>
+            <w:proofErr w:type="spellStart"/>
             <w:r>
-              <w:t>Secretariado-Geral</w:t>
+              <w:rPr>
+                <w:rFonts w:ascii="Arial" w:hAnsi="Arial" w:cs="Arial"/>
+              </w:rPr>
+              <w:t>Secretariado</w:t>
+            </w:r>
+            <w:proofErr w:type="spellEnd"/>
+            <w:r>
+              <w:rPr>
+                <w:rFonts w:ascii="Arial" w:hAnsi="Arial" w:cs="Arial"/>
+              </w:rPr>
+              <w:t>-Geral</w:t>
             </w:r>
           </w:p>
         </w:tc>
@@ -1594,7 +2072,15 @@
             </w:tcMar>
           </w:tcPr>
           <w:p>
+            <w:pPr>
+              <w:rPr>
+                <w:rFonts w:ascii="Arial" w:hAnsi="Arial" w:cs="Arial"/>
+              </w:rPr>
+            </w:pPr>
             <w:r>
+              <w:rPr>
+                <w:rFonts w:ascii="Arial" w:hAnsi="Arial" w:cs="Arial"/>
+              </w:rPr>
               <w:t>Alta Prioridade</w:t>
             </w:r>
           </w:p>
@@ -1616,7 +2102,15 @@
             </w:tcMar>
           </w:tcPr>
           <w:p>
+            <w:pPr>
+              <w:rPr>
+                <w:rFonts w:ascii="Arial" w:hAnsi="Arial" w:cs="Arial"/>
+              </w:rPr>
+            </w:pPr>
             <w:r>
+              <w:rPr>
+                <w:rFonts w:ascii="Arial" w:hAnsi="Arial" w:cs="Arial"/>
+              </w:rPr>
               <w:t>2</w:t>
             </w:r>
           </w:p>
@@ -1633,8 +2127,57 @@
             </w:tcMar>
           </w:tcPr>
           <w:p>
+            <w:pPr>
+              <w:rPr>
+                <w:rFonts w:ascii="Arial" w:hAnsi="Arial" w:cs="Arial"/>
+                <w:lang w:val="pt-PT"/>
+              </w:rPr>
+            </w:pPr>
             <w:r>
-              <w:t>Criar Conta PayPal Business Comercial oficial da OAGB e obter as credenciais de produção (Client ID).</w:t>
+              <w:rPr>
+                <w:rFonts w:ascii="Arial" w:hAnsi="Arial" w:cs="Arial"/>
+                <w:lang w:val="pt-PT"/>
+              </w:rPr>
+              <w:t xml:space="preserve">Criar Conta </w:t>
+            </w:r>
+            <w:proofErr w:type="spellStart"/>
+            <w:r>
+              <w:rPr>
+                <w:rFonts w:ascii="Arial" w:hAnsi="Arial" w:cs="Arial"/>
+                <w:lang w:val="pt-PT"/>
+              </w:rPr>
+              <w:t>PayPal</w:t>
+            </w:r>
+            <w:proofErr w:type="spellEnd"/>
+            <w:r>
+              <w:rPr>
+                <w:rFonts w:ascii="Arial" w:hAnsi="Arial" w:cs="Arial"/>
+                <w:lang w:val="pt-PT"/>
+              </w:rPr>
+              <w:t xml:space="preserve"> Business Comercial oficial da OAGB e obter as credenciais de </w:t>
+            </w:r>
+            <w:r>
+              <w:rPr>
+                <w:rFonts w:ascii="Arial" w:hAnsi="Arial" w:cs="Arial"/>
+                <w:lang w:val="pt-PT"/>
+              </w:rPr>
+              <w:t>produção (</w:t>
+            </w:r>
+            <w:proofErr w:type="spellStart"/>
+            <w:r>
+              <w:rPr>
+                <w:rFonts w:ascii="Arial" w:hAnsi="Arial" w:cs="Arial"/>
+                <w:lang w:val="pt-PT"/>
+              </w:rPr>
+              <w:t>Client</w:t>
+            </w:r>
+            <w:proofErr w:type="spellEnd"/>
+            <w:r>
+              <w:rPr>
+                <w:rFonts w:ascii="Arial" w:hAnsi="Arial" w:cs="Arial"/>
+                <w:lang w:val="pt-PT"/>
+              </w:rPr>
+              <w:t xml:space="preserve"> ID).</w:t>
             </w:r>
           </w:p>
         </w:tc>
@@ -1650,9 +2193,33 @@
             </w:tcMar>
           </w:tcPr>
           <w:p>
+            <w:pPr>
+              <w:rPr>
+                <w:rFonts w:ascii="Arial" w:hAnsi="Arial" w:cs="Arial"/>
+              </w:rPr>
+            </w:pPr>
+            <w:proofErr w:type="spellStart"/>
             <w:r>
-              <w:t>Conselho de Tesouraria</w:t>
+              <w:rPr>
+                <w:rFonts w:ascii="Arial" w:hAnsi="Arial" w:cs="Arial"/>
+              </w:rPr>
+              <w:t>Conselho</w:t>
             </w:r>
+            <w:proofErr w:type="spellEnd"/>
+            <w:r>
+              <w:rPr>
+                <w:rFonts w:ascii="Arial" w:hAnsi="Arial" w:cs="Arial"/>
+              </w:rPr>
+              <w:t xml:space="preserve"> de </w:t>
+            </w:r>
+            <w:proofErr w:type="spellStart"/>
+            <w:r>
+              <w:rPr>
+                <w:rFonts w:ascii="Arial" w:hAnsi="Arial" w:cs="Arial"/>
+              </w:rPr>
+              <w:t>Tesouraria</w:t>
+            </w:r>
+            <w:proofErr w:type="spellEnd"/>
           </w:p>
         </w:tc>
         <w:tc>
@@ -1667,7 +2234,15 @@
             </w:tcMar>
           </w:tcPr>
           <w:p>
+            <w:pPr>
+              <w:rPr>
+                <w:rFonts w:ascii="Arial" w:hAnsi="Arial" w:cs="Arial"/>
+              </w:rPr>
+            </w:pPr>
             <w:r>
+              <w:rPr>
+                <w:rFonts w:ascii="Arial" w:hAnsi="Arial" w:cs="Arial"/>
+              </w:rPr>
               <w:t>Alta Prioridade</w:t>
             </w:r>
           </w:p>
@@ -1689,7 +2264,15 @@
             </w:tcMar>
           </w:tcPr>
           <w:p>
+            <w:pPr>
+              <w:rPr>
+                <w:rFonts w:ascii="Arial" w:hAnsi="Arial" w:cs="Arial"/>
+              </w:rPr>
+            </w:pPr>
             <w:r>
+              <w:rPr>
+                <w:rFonts w:ascii="Arial" w:hAnsi="Arial" w:cs="Arial"/>
+              </w:rPr>
               <w:t>3</w:t>
             </w:r>
           </w:p>
@@ -1706,8 +2289,66 @@
             </w:tcMar>
           </w:tcPr>
           <w:p>
+            <w:pPr>
+              <w:rPr>
+                <w:rFonts w:ascii="Arial" w:hAnsi="Arial" w:cs="Arial"/>
+                <w:lang w:val="pt-PT"/>
+              </w:rPr>
+            </w:pPr>
             <w:r>
-              <w:t>Criar conta corporativa e submeter documentação da Ordem (IBAN, NIF, Estatutos) no gateway regional FedaPay ou CinetPay.</w:t>
+              <w:rPr>
+                <w:rFonts w:ascii="Arial" w:hAnsi="Arial" w:cs="Arial"/>
+                <w:lang w:val="pt-PT"/>
+              </w:rPr>
+              <w:t xml:space="preserve">Criar conta corporativa e submeter documentação da Ordem (IBAN, NIF, Estatutos) no </w:t>
+            </w:r>
+            <w:proofErr w:type="spellStart"/>
+            <w:r>
+              <w:rPr>
+                <w:rFonts w:ascii="Arial" w:hAnsi="Arial" w:cs="Arial"/>
+                <w:lang w:val="pt-PT"/>
+              </w:rPr>
+              <w:t>gateway</w:t>
+            </w:r>
+            <w:proofErr w:type="spellEnd"/>
+            <w:r>
+              <w:rPr>
+                <w:rFonts w:ascii="Arial" w:hAnsi="Arial" w:cs="Arial"/>
+                <w:lang w:val="pt-PT"/>
+              </w:rPr>
+              <w:t xml:space="preserve"> regional </w:t>
+            </w:r>
+            <w:proofErr w:type="spellStart"/>
+            <w:r>
+              <w:rPr>
+                <w:rFonts w:ascii="Arial" w:hAnsi="Arial" w:cs="Arial"/>
+                <w:lang w:val="pt-PT"/>
+              </w:rPr>
+              <w:t>FedaPay</w:t>
+            </w:r>
+            <w:proofErr w:type="spellEnd"/>
+            <w:r>
+              <w:rPr>
+                <w:rFonts w:ascii="Arial" w:hAnsi="Arial" w:cs="Arial"/>
+                <w:lang w:val="pt-PT"/>
+              </w:rPr>
+              <w:t xml:space="preserve"> ou </w:t>
+            </w:r>
+            <w:proofErr w:type="spellStart"/>
+            <w:r>
+              <w:rPr>
+                <w:rFonts w:ascii="Arial" w:hAnsi="Arial" w:cs="Arial"/>
+                <w:lang w:val="pt-PT"/>
+              </w:rPr>
+              <w:t>CinetPay</w:t>
+            </w:r>
+            <w:proofErr w:type="spellEnd"/>
+            <w:r>
+              <w:rPr>
+                <w:rFonts w:ascii="Arial" w:hAnsi="Arial" w:cs="Arial"/>
+                <w:lang w:val="pt-PT"/>
+              </w:rPr>
+              <w:t>.</w:t>
             </w:r>
           </w:p>
         </w:tc>
@@ -1723,9 +2364,33 @@
             </w:tcMar>
           </w:tcPr>
           <w:p>
+            <w:pPr>
+              <w:rPr>
+                <w:rFonts w:ascii="Arial" w:hAnsi="Arial" w:cs="Arial"/>
+              </w:rPr>
+            </w:pPr>
+            <w:proofErr w:type="spellStart"/>
             <w:r>
-              <w:t>Conselho de Tesouraria</w:t>
+              <w:rPr>
+                <w:rFonts w:ascii="Arial" w:hAnsi="Arial" w:cs="Arial"/>
+              </w:rPr>
+              <w:t>Conselho</w:t>
             </w:r>
+            <w:proofErr w:type="spellEnd"/>
+            <w:r>
+              <w:rPr>
+                <w:rFonts w:ascii="Arial" w:hAnsi="Arial" w:cs="Arial"/>
+              </w:rPr>
+              <w:t xml:space="preserve"> de </w:t>
+            </w:r>
+            <w:proofErr w:type="spellStart"/>
+            <w:r>
+              <w:rPr>
+                <w:rFonts w:ascii="Arial" w:hAnsi="Arial" w:cs="Arial"/>
+              </w:rPr>
+              <w:t>Tesouraria</w:t>
+            </w:r>
+            <w:proofErr w:type="spellEnd"/>
           </w:p>
         </w:tc>
         <w:tc>
@@ -1740,7 +2405,15 @@
             </w:tcMar>
           </w:tcPr>
           <w:p>
+            <w:pPr>
+              <w:rPr>
+                <w:rFonts w:ascii="Arial" w:hAnsi="Arial" w:cs="Arial"/>
+              </w:rPr>
+            </w:pPr>
             <w:r>
+              <w:rPr>
+                <w:rFonts w:ascii="Arial" w:hAnsi="Arial" w:cs="Arial"/>
+              </w:rPr>
               <w:t>Média Prioridade</w:t>
             </w:r>
           </w:p>
@@ -1762,7 +2435,15 @@
             </w:tcMar>
           </w:tcPr>
           <w:p>
+            <w:pPr>
+              <w:rPr>
+                <w:rFonts w:ascii="Arial" w:hAnsi="Arial" w:cs="Arial"/>
+              </w:rPr>
+            </w:pPr>
             <w:r>
+              <w:rPr>
+                <w:rFonts w:ascii="Arial" w:hAnsi="Arial" w:cs="Arial"/>
+              </w:rPr>
               <w:t>4</w:t>
             </w:r>
           </w:p>
@@ -1779,8 +2460,57 @@
             </w:tcMar>
           </w:tcPr>
           <w:p>
+            <w:pPr>
+              <w:rPr>
+                <w:rFonts w:ascii="Arial" w:hAnsi="Arial" w:cs="Arial"/>
+                <w:lang w:val="pt-PT"/>
+              </w:rPr>
+            </w:pPr>
             <w:r>
-              <w:t>Receber as credenciais e chaves digitais de ambas as operadoras/gateways/PayPal.</w:t>
+              <w:rPr>
+                <w:rFonts w:ascii="Arial" w:hAnsi="Arial" w:cs="Arial"/>
+                <w:lang w:val="pt-PT"/>
+              </w:rPr>
+              <w:t xml:space="preserve">Receber as </w:t>
+            </w:r>
+            <w:r>
+              <w:rPr>
+                <w:rFonts w:ascii="Arial" w:hAnsi="Arial" w:cs="Arial"/>
+                <w:lang w:val="pt-PT"/>
+              </w:rPr>
+              <w:t>credenciais e chaves digitais de ambas as operadoras/</w:t>
+            </w:r>
+            <w:proofErr w:type="spellStart"/>
+            <w:r>
+              <w:rPr>
+                <w:rFonts w:ascii="Arial" w:hAnsi="Arial" w:cs="Arial"/>
+                <w:lang w:val="pt-PT"/>
+              </w:rPr>
+              <w:t>gateways</w:t>
+            </w:r>
+            <w:proofErr w:type="spellEnd"/>
+            <w:r>
+              <w:rPr>
+                <w:rFonts w:ascii="Arial" w:hAnsi="Arial" w:cs="Arial"/>
+                <w:lang w:val="pt-PT"/>
+              </w:rPr>
+              <w:t>/</w:t>
+            </w:r>
+            <w:proofErr w:type="spellStart"/>
+            <w:r>
+              <w:rPr>
+                <w:rFonts w:ascii="Arial" w:hAnsi="Arial" w:cs="Arial"/>
+                <w:lang w:val="pt-PT"/>
+              </w:rPr>
+              <w:t>PayPal</w:t>
+            </w:r>
+            <w:proofErr w:type="spellEnd"/>
+            <w:r>
+              <w:rPr>
+                <w:rFonts w:ascii="Arial" w:hAnsi="Arial" w:cs="Arial"/>
+                <w:lang w:val="pt-PT"/>
+              </w:rPr>
+              <w:t>.</w:t>
             </w:r>
           </w:p>
         </w:tc>
@@ -1796,8 +2526,24 @@
             </w:tcMar>
           </w:tcPr>
           <w:p>
+            <w:pPr>
+              <w:rPr>
+                <w:rFonts w:ascii="Arial" w:hAnsi="Arial" w:cs="Arial"/>
+              </w:rPr>
+            </w:pPr>
+            <w:proofErr w:type="spellStart"/>
             <w:r>
-              <w:t>Departamento de TI / Programador</w:t>
+              <w:rPr>
+                <w:rFonts w:ascii="Arial" w:hAnsi="Arial" w:cs="Arial"/>
+              </w:rPr>
+              <w:t>Departamento</w:t>
+            </w:r>
+            <w:proofErr w:type="spellEnd"/>
+            <w:r>
+              <w:rPr>
+                <w:rFonts w:ascii="Arial" w:hAnsi="Arial" w:cs="Arial"/>
+              </w:rPr>
+              <w:t xml:space="preserve"> de TI / Programador</w:t>
             </w:r>
           </w:p>
         </w:tc>
@@ -1813,56 +2559,138 @@
             </w:tcMar>
           </w:tcPr>
           <w:p>
+            <w:pPr>
+              <w:rPr>
+                <w:rFonts w:ascii="Arial" w:hAnsi="Arial" w:cs="Arial"/>
+              </w:rPr>
+            </w:pPr>
             <w:r>
+              <w:rPr>
+                <w:rFonts w:ascii="Arial" w:hAnsi="Arial" w:cs="Arial"/>
+              </w:rPr>
               <w:t>Aguardando Etapas Anteriores</w:t>
             </w:r>
           </w:p>
         </w:tc>
       </w:tr>
       <w:tr>
+        <w:trPr>
+          <w:jc w:val="center"/>
+        </w:trPr>
         <w:tc>
           <w:tcPr>
-            <w:tcW w:type="dxa" w:w="1152"/>
+            <w:tcW w:w="1152" w:type="dxa"/>
           </w:tcPr>
           <w:p>
+            <w:pPr>
+              <w:rPr>
+                <w:rFonts w:ascii="Arial" w:hAnsi="Arial" w:cs="Arial"/>
+              </w:rPr>
+            </w:pPr>
             <w:r>
+              <w:rPr>
+                <w:rFonts w:ascii="Arial" w:hAnsi="Arial" w:cs="Arial"/>
+              </w:rPr>
               <w:t>5</w:t>
             </w:r>
           </w:p>
         </w:tc>
         <w:tc>
           <w:tcPr>
-            <w:tcW w:type="dxa" w:w="4320"/>
+            <w:tcW w:w="4320" w:type="dxa"/>
           </w:tcPr>
           <w:p>
+            <w:pPr>
+              <w:rPr>
+                <w:rFonts w:ascii="Arial" w:hAnsi="Arial" w:cs="Arial"/>
+                <w:lang w:val="pt-PT"/>
+              </w:rPr>
+            </w:pPr>
             <w:r>
-              <w:t>Inserir as chaves no portal de administração (Admin → Financeiro → Configurações) e ativar os sistemas em produção.</w:t>
+              <w:rPr>
+                <w:rFonts w:ascii="Arial" w:hAnsi="Arial" w:cs="Arial"/>
+                <w:lang w:val="pt-PT"/>
+              </w:rPr>
+              <w:t>Inserir as chaves no portal de administração (</w:t>
+            </w:r>
+            <w:proofErr w:type="spellStart"/>
+            <w:r>
+              <w:rPr>
+                <w:rFonts w:ascii="Arial" w:hAnsi="Arial" w:cs="Arial"/>
+                <w:lang w:val="pt-PT"/>
+              </w:rPr>
+              <w:t>Admin</w:t>
+            </w:r>
+            <w:proofErr w:type="spellEnd"/>
+            <w:r>
+              <w:rPr>
+                <w:rFonts w:ascii="Arial" w:hAnsi="Arial" w:cs="Arial"/>
+                <w:lang w:val="pt-PT"/>
+              </w:rPr>
+              <w:t xml:space="preserve"> → Financeiro → Configurações) e ativar os sistemas em </w:t>
+            </w:r>
+            <w:r>
+              <w:rPr>
+                <w:rFonts w:ascii="Arial" w:hAnsi="Arial" w:cs="Arial"/>
+                <w:lang w:val="pt-PT"/>
+              </w:rPr>
+              <w:t>produção.</w:t>
             </w:r>
           </w:p>
         </w:tc>
         <w:tc>
           <w:tcPr>
-            <w:tcW w:type="dxa" w:w="1872"/>
+            <w:tcW w:w="1872" w:type="dxa"/>
           </w:tcPr>
           <w:p>
+            <w:pPr>
+              <w:rPr>
+                <w:rFonts w:ascii="Arial" w:hAnsi="Arial" w:cs="Arial"/>
+              </w:rPr>
+            </w:pPr>
+            <w:proofErr w:type="spellStart"/>
             <w:r>
-              <w:t>Administrador do Portal</w:t>
+              <w:rPr>
+                <w:rFonts w:ascii="Arial" w:hAnsi="Arial" w:cs="Arial"/>
+              </w:rPr>
+              <w:t>Administrador</w:t>
+            </w:r>
+            <w:proofErr w:type="spellEnd"/>
+            <w:r>
+              <w:rPr>
+                <w:rFonts w:ascii="Arial" w:hAnsi="Arial" w:cs="Arial"/>
+              </w:rPr>
+              <w:t xml:space="preserve"> do Portal</w:t>
             </w:r>
           </w:p>
         </w:tc>
         <w:tc>
           <w:tcPr>
-            <w:tcW w:type="dxa" w:w="2016"/>
+            <w:tcW w:w="2016" w:type="dxa"/>
           </w:tcPr>
           <w:p>
+            <w:pPr>
+              <w:rPr>
+                <w:rFonts w:ascii="Arial" w:hAnsi="Arial" w:cs="Arial"/>
+              </w:rPr>
+            </w:pPr>
             <w:r>
+              <w:rPr>
+                <w:rFonts w:ascii="Arial" w:hAnsi="Arial" w:cs="Arial"/>
+              </w:rPr>
               <w:t>Fase Final</w:t>
             </w:r>
           </w:p>
         </w:tc>
       </w:tr>
     </w:tbl>
-    <w:p/>
+    <w:p>
+      <w:pPr>
+        <w:rPr>
+          <w:rFonts w:ascii="Arial" w:hAnsi="Arial" w:cs="Arial"/>
+        </w:rPr>
+      </w:pPr>
+    </w:p>
     <w:sectPr>
       <w:pgSz w:w="12240" w:h="15840"/>
       <w:pgMar w:top="1440" w:right="1440" w:bottom="1440" w:left="1440" w:header="720" w:footer="720" w:gutter="0"/>
@@ -2361,11 +3189,6 @@
     <w:lsdException w:name="Book Title" w:uiPriority="33" w:qFormat="1"/>
     <w:lsdException w:name="Bibliography" w:semiHidden="1" w:uiPriority="37" w:unhideWhenUsed="1"/>
     <w:lsdException w:name="TOC Heading" w:semiHidden="1" w:uiPriority="39" w:unhideWhenUsed="1" w:qFormat="1"/>
-    <w:lsdException w:name="Plain Table 5" w:semiHidden="1" w:unhideWhenUsed="1"/>
-    <w:lsdException w:name="Grid Table Light" w:semiHidden="1" w:unhideWhenUsed="1"/>
-    <w:lsdException w:name="Grid Table 1 Light" w:semiHidden="1" w:unhideWhenUsed="1"/>
-    <w:lsdException w:name="Grid Table 2" w:semiHidden="1" w:unhideWhenUsed="1"/>
-    <w:lsdException w:name="Grid Table 3" w:semiHidden="1" w:unhideWhenUsed="1"/>
     <w:lsdException w:name="Grid Table 4" w:uiPriority="49"/>
     <w:lsdException w:name="Grid Table 5 Dark" w:uiPriority="50"/>
     <w:lsdException w:name="Grid Table 6 Colorful" w:uiPriority="51"/>

</xml_diff>